<commit_message>
fixed UI for arabic typefont and carousel rtl
</commit_message>
<xml_diff>
--- a/MADAREK-Translation.docx
+++ b/MADAREK-Translation.docx
@@ -1081,7 +1081,7 @@
                 <w:szCs w:val="20"/>
                 <w:rFonts w:ascii="Arial" w:cs="Arial" w:eastAsia="Arial" w:hAnsi="Arial"/>
               </w:rPr>
-              <w:t xml:space="preserve">المركز الإعلامي</w:t>
+              <w:t xml:space="preserve">الإعلام</w:t>
             </w:r>
           </w:p>
         </w:tc>
@@ -1826,7 +1826,7 @@
                 <w:szCs w:val="20"/>
                 <w:rFonts w:ascii="Arial" w:cs="Arial" w:eastAsia="Arial" w:hAnsi="Arial"/>
               </w:rPr>
-              <w:t xml:space="preserve">القائمة الرئيسية</w:t>
+              <w:t xml:space="preserve">الرئيسية</w:t>
             </w:r>
           </w:p>
         </w:tc>
@@ -2109,7 +2109,7 @@
                 <w:szCs w:val="20"/>
                 <w:rFonts w:ascii="Arial" w:cs="Arial" w:eastAsia="Arial" w:hAnsi="Arial"/>
               </w:rPr>
-              <w:t xml:space="preserve">مجتمعٌ من المدارس في أنحاء الخليج، مكرَّسٌ للتميّز الأكاديمي والأثر التعليمي المستدام.</w:t>
+              <w:t xml:space="preserve">مجتمع من المدارس في منطقة الخليج، مكرّس للتميّز الأكاديمي والأثر التعليمي المستدام.</w:t>
             </w:r>
           </w:p>
         </w:tc>
@@ -2700,7 +2700,7 @@
                 <w:szCs w:val="20"/>
                 <w:rFonts w:ascii="Arial" w:cs="Arial" w:eastAsia="Arial" w:hAnsi="Arial"/>
               </w:rPr>
-              <w:t xml:space="preserve">قيد الإعداد</w:t>
+              <w:t xml:space="preserve">عنصر نائب</w:t>
             </w:r>
           </w:p>
         </w:tc>
@@ -2777,7 +2777,7 @@
                 <w:szCs w:val="20"/>
                 <w:rFonts w:ascii="Arial" w:cs="Arial" w:eastAsia="Arial" w:hAnsi="Arial"/>
               </w:rPr>
-              <w:t xml:space="preserve">هذه الصفحة موجودة ضمن هيكل الموقع، غير أنها ليست من محاور إعادة التصميم الحالية.</w:t>
+              <w:t xml:space="preserve">هذه الصفحة موجودة ضمن هيكل الموقع ولكنها ليست من ضمن نطاق إعادة التصميم.</w:t>
             </w:r>
           </w:p>
         </w:tc>
@@ -3137,7 +3137,7 @@
                 <w:szCs w:val="20"/>
                 <w:rFonts w:ascii="Arial" w:cs="Arial" w:eastAsia="Arial" w:hAnsi="Arial"/>
               </w:rPr>
-              <w:t xml:space="preserve">الصفحة التي تبحث عنها غير متوفّرة — ربما نُقلت أو لم يعد الرابط صالحًا.</w:t>
+              <w:t xml:space="preserve">الصفحة التي تبحث عنها غير متوفرة — ربما تم نقلها أو أن الرابط لم يعد صالحًا.</w:t>
             </w:r>
           </w:p>
         </w:tc>
@@ -3969,7 +3969,7 @@
                 <w:szCs w:val="20"/>
                 <w:rFonts w:ascii="Arial" w:cs="Arial" w:eastAsia="Arial" w:hAnsi="Arial"/>
               </w:rPr>
-              <w:t xml:space="preserve">مدارك · التعليم في دول مجلس التعاون الخليجي · تأسست عام 2026</w:t>
+              <w:t xml:space="preserve">مدارك · نحو مستقبل التعليم في دول مجلس التعاون الخليجي · منذ 2026</w:t>
             </w:r>
           </w:p>
         </w:tc>
@@ -4123,7 +4123,7 @@
                 <w:szCs w:val="20"/>
                 <w:rFonts w:ascii="Arial" w:cs="Arial" w:eastAsia="Arial" w:hAnsi="Arial"/>
               </w:rPr>
-              <w:t xml:space="preserve">التعليم.</w:t>
+              <w:t xml:space="preserve">التعليم</w:t>
             </w:r>
           </w:p>
         </w:tc>
@@ -4200,7 +4200,7 @@
                 <w:szCs w:val="20"/>
                 <w:rFonts w:ascii="Arial" w:cs="Arial" w:eastAsia="Arial" w:hAnsi="Arial"/>
               </w:rPr>
-              <w:t xml:space="preserve">شبكة متنامية من المدارس العالمية في أنحاء دول مجلس التعاون الخليجي.</w:t>
+              <w:t xml:space="preserve">شبكة متنامية من المدارس الدولية في دول مجلس التعاون الخليجي.</w:t>
             </w:r>
           </w:p>
         </w:tc>
@@ -4354,7 +4354,7 @@
                 <w:szCs w:val="20"/>
                 <w:rFonts w:ascii="Arial" w:cs="Arial" w:eastAsia="Arial" w:hAnsi="Arial"/>
               </w:rPr>
-              <w:t xml:space="preserve">مرِّر للأسفل</w:t>
+              <w:t xml:space="preserve">مرّر</w:t>
             </w:r>
           </w:p>
         </w:tc>
@@ -4637,7 +4637,7 @@
                 <w:szCs w:val="20"/>
                 <w:rFonts w:ascii="Arial" w:cs="Arial" w:eastAsia="Arial" w:hAnsi="Arial"/>
               </w:rPr>
-              <w:t xml:space="preserve">منصّة تعليمية</w:t>
+              <w:t xml:space="preserve">منصة تعليمية</w:t>
             </w:r>
           </w:p>
         </w:tc>
@@ -4714,7 +4714,7 @@
                 <w:szCs w:val="20"/>
                 <w:rFonts w:ascii="Arial" w:cs="Arial" w:eastAsia="Arial" w:hAnsi="Arial"/>
               </w:rPr>
-              <w:t xml:space="preserve">إقليمية.</w:t>
+              <w:t xml:space="preserve">إقليمية</w:t>
             </w:r>
           </w:p>
         </w:tc>
@@ -4791,7 +4791,7 @@
                 <w:szCs w:val="20"/>
                 <w:rFonts w:ascii="Arial" w:cs="Arial" w:eastAsia="Arial" w:hAnsi="Arial"/>
               </w:rPr>
-              <w:t xml:space="preserve">مقدّمة</w:t>
+              <w:t xml:space="preserve">نبذة</w:t>
             </w:r>
           </w:p>
         </w:tc>
@@ -4868,7 +4868,7 @@
                 <w:szCs w:val="20"/>
                 <w:rFonts w:ascii="Arial" w:cs="Arial" w:eastAsia="Arial" w:hAnsi="Arial"/>
               </w:rPr>
-              <w:t xml:space="preserve">مدارك شبكة متنامية من المدارس في أنحاء دول مجلس التعاون الخليجي، تجمعها رؤية واحدة: التميّز الأكاديمي وإعداد طلبة واثقين متكاملي الشخصية.</w:t>
+              <w:t xml:space="preserve">مدارك شبكة متنامية من المدارس في دول مجلس التعاون الخليجي، يجمعها التزام راسخ بالتميز الأكاديمي وتنمية طلاب واثقين بأنفسهم، متكاملين في معارفهم ومهاراتهم وشخصياتهم.</w:t>
             </w:r>
           </w:p>
         </w:tc>
@@ -4945,7 +4945,7 @@
                 <w:szCs w:val="20"/>
                 <w:rFonts w:ascii="Arial" w:cs="Arial" w:eastAsia="Arial" w:hAnsi="Arial"/>
               </w:rPr>
-              <w:t xml:space="preserve">من خلال مناهج معتمدة عالميًا وبيئات تعلّم حديثة، نساعد طلبتنا على التفوّق، ونُسهم في تنمية المجتمعات التي نخدمها.</w:t>
+              <w:t xml:space="preserve">من خلال مناهج تعليمية معترف بها دولياً وبيئات تعليمية حديثة، نُمكّن طلابنا من تحقيق إمكاناتهم والتميز في مسيرتهم التعليمية، والإسهام بفاعلية في مجتمعاتهم.</w:t>
             </w:r>
           </w:p>
         </w:tc>
@@ -5022,7 +5022,7 @@
                 <w:szCs w:val="20"/>
                 <w:rFonts w:ascii="Arial" w:cs="Arial" w:eastAsia="Arial" w:hAnsi="Arial"/>
               </w:rPr>
-              <w:t xml:space="preserve">اقرأ القصة كاملةً</w:t>
+              <w:t xml:space="preserve">اكتشف قصة مدارك</w:t>
             </w:r>
           </w:p>
         </w:tc>
@@ -5305,7 +5305,7 @@
                 <w:szCs w:val="20"/>
                 <w:rFonts w:ascii="Arial" w:cs="Arial" w:eastAsia="Arial" w:hAnsi="Arial"/>
               </w:rPr>
-              <w:t xml:space="preserve">أربع ركائز.</w:t>
+              <w:t xml:space="preserve">أربع ركائز</w:t>
             </w:r>
           </w:p>
         </w:tc>
@@ -5382,7 +5382,7 @@
                 <w:szCs w:val="20"/>
                 <w:rFonts w:ascii="Arial" w:cs="Arial" w:eastAsia="Arial" w:hAnsi="Arial"/>
               </w:rPr>
-              <w:t xml:space="preserve">واتجاه واحد.</w:t>
+              <w:t xml:space="preserve">رؤية واحدة</w:t>
             </w:r>
           </w:p>
         </w:tc>
@@ -5536,7 +5536,7 @@
                 <w:szCs w:val="20"/>
                 <w:rFonts w:ascii="Arial" w:cs="Arial" w:eastAsia="Arial" w:hAnsi="Arial"/>
               </w:rPr>
-              <w:t xml:space="preserve">تعليمٌ عالي الجودة يُنمّي شخصية الطالب المتكاملة.</w:t>
+              <w:t xml:space="preserve">تعليم نوعي ينمّي الطالب معرفياً وشخصياً ومهارياً.</w:t>
             </w:r>
           </w:p>
         </w:tc>
@@ -5690,7 +5690,7 @@
                 <w:szCs w:val="20"/>
                 <w:rFonts w:ascii="Arial" w:cs="Arial" w:eastAsia="Arial" w:hAnsi="Arial"/>
               </w:rPr>
-              <w:t xml:space="preserve">التفكير الناقد</w:t>
+              <w:t xml:space="preserve">التفكير النقدي</w:t>
             </w:r>
           </w:p>
         </w:tc>
@@ -5767,7 +5767,7 @@
                 <w:szCs w:val="20"/>
                 <w:rFonts w:ascii="Arial" w:cs="Arial" w:eastAsia="Arial" w:hAnsi="Arial"/>
               </w:rPr>
-              <w:t xml:space="preserve">التنمية الشاملة</w:t>
+              <w:t xml:space="preserve">النمو الشامل للطالب</w:t>
             </w:r>
           </w:p>
         </w:tc>
@@ -5921,7 +5921,7 @@
                 <w:szCs w:val="20"/>
                 <w:rFonts w:ascii="Arial" w:cs="Arial" w:eastAsia="Arial" w:hAnsi="Arial"/>
               </w:rPr>
-              <w:t xml:space="preserve">بيئاتٌ مواكبة للمستقبل قائمة على الإبداع والتقنية.</w:t>
+              <w:t xml:space="preserve">بيئات تعليمية مبتكرة تجمع بين الإبداع والتكنولوجيا لمواكبة المستقبل.</w:t>
             </w:r>
           </w:p>
         </w:tc>
@@ -5998,7 +5998,7 @@
                 <w:szCs w:val="20"/>
                 <w:rFonts w:ascii="Arial" w:cs="Arial" w:eastAsia="Arial" w:hAnsi="Arial"/>
               </w:rPr>
-              <w:t xml:space="preserve">التقنية</w:t>
+              <w:t xml:space="preserve">التكنولوجيا</w:t>
             </w:r>
           </w:p>
         </w:tc>
@@ -6152,7 +6152,7 @@
                 <w:szCs w:val="20"/>
                 <w:rFonts w:ascii="Arial" w:cs="Arial" w:eastAsia="Arial" w:hAnsi="Arial"/>
               </w:rPr>
-              <w:t xml:space="preserve">أساليب جديدة</w:t>
+              <w:t xml:space="preserve">أساليب مبتكرة</w:t>
             </w:r>
           </w:p>
         </w:tc>
@@ -6229,7 +6229,7 @@
                 <w:szCs w:val="20"/>
                 <w:rFonts w:ascii="Arial" w:cs="Arial" w:eastAsia="Arial" w:hAnsi="Arial"/>
               </w:rPr>
-              <w:t xml:space="preserve">النمو الإقليمي</w:t>
+              <w:t xml:space="preserve">النمو والتوسع الإقليمي</w:t>
             </w:r>
           </w:p>
         </w:tc>
@@ -6306,7 +6306,7 @@
                 <w:szCs w:val="20"/>
                 <w:rFonts w:ascii="Arial" w:cs="Arial" w:eastAsia="Arial" w:hAnsi="Arial"/>
               </w:rPr>
-              <w:t xml:space="preserve">منظومة تعليمية رائدة في أنحاء الخليج وخارجه.</w:t>
+              <w:t xml:space="preserve">منظومة تعليمية رائدة تمتد عبر دول مجلس التعاون الخليجي وخارجها.</w:t>
             </w:r>
           </w:p>
         </w:tc>
@@ -6383,7 +6383,7 @@
                 <w:szCs w:val="20"/>
                 <w:rFonts w:ascii="Arial" w:cs="Arial" w:eastAsia="Arial" w:hAnsi="Arial"/>
               </w:rPr>
-              <w:t xml:space="preserve">التوسّع الاستراتيجي</w:t>
+              <w:t xml:space="preserve">التوسع الاستراتيجي</w:t>
             </w:r>
           </w:p>
         </w:tc>
@@ -6537,7 +6537,7 @@
                 <w:szCs w:val="20"/>
                 <w:rFonts w:ascii="Arial" w:cs="Arial" w:eastAsia="Arial" w:hAnsi="Arial"/>
               </w:rPr>
-              <w:t xml:space="preserve">الخليج وما بعده</w:t>
+              <w:t xml:space="preserve">دول مجلس التعاون الخليجي وخارجها</w:t>
             </w:r>
           </w:p>
         </w:tc>
@@ -6614,7 +6614,7 @@
                 <w:szCs w:val="20"/>
                 <w:rFonts w:ascii="Arial" w:cs="Arial" w:eastAsia="Arial" w:hAnsi="Arial"/>
               </w:rPr>
-              <w:t xml:space="preserve">أثرٌ مستدام</w:t>
+              <w:t xml:space="preserve">أثر مستدام</w:t>
             </w:r>
           </w:p>
         </w:tc>
@@ -6691,7 +6691,7 @@
                 <w:szCs w:val="20"/>
                 <w:rFonts w:ascii="Arial" w:cs="Arial" w:eastAsia="Arial" w:hAnsi="Arial"/>
               </w:rPr>
-              <w:t xml:space="preserve">نتائج إيجابية ومستدامة لأجيالٍ قادمة.</w:t>
+              <w:t xml:space="preserve">أثر إيجابي ومستدام يمتد لأجيال قادمة.</w:t>
             </w:r>
           </w:p>
         </w:tc>
@@ -6768,7 +6768,7 @@
                 <w:szCs w:val="20"/>
                 <w:rFonts w:ascii="Arial" w:cs="Arial" w:eastAsia="Arial" w:hAnsi="Arial"/>
               </w:rPr>
-              <w:t xml:space="preserve">الطلبة والمعلّمون</w:t>
+              <w:t xml:space="preserve">الطلاب والكوادر التعليمية</w:t>
             </w:r>
           </w:p>
         </w:tc>
@@ -7128,7 +7128,7 @@
                 <w:szCs w:val="20"/>
                 <w:rFonts w:ascii="Arial" w:cs="Arial" w:eastAsia="Arial" w:hAnsi="Arial"/>
               </w:rPr>
-              <w:t xml:space="preserve">المدرسة مكانٌ</w:t>
+              <w:t xml:space="preserve">المدرسة مكان</w:t>
             </w:r>
           </w:p>
         </w:tc>
@@ -7205,7 +7205,7 @@
                 <w:szCs w:val="20"/>
                 <w:rFonts w:ascii="Arial" w:cs="Arial" w:eastAsia="Arial" w:hAnsi="Arial"/>
               </w:rPr>
-              <w:t xml:space="preserve">يُعرَف فيه كل طالبٍ</w:t>
+              <w:t xml:space="preserve">يُعرَف فيه كل طالب</w:t>
             </w:r>
           </w:p>
         </w:tc>
@@ -7282,7 +7282,7 @@
                 <w:szCs w:val="20"/>
                 <w:rFonts w:ascii="Arial" w:cs="Arial" w:eastAsia="Arial" w:hAnsi="Arial"/>
               </w:rPr>
-              <w:t xml:space="preserve">حقّ المعرفة.</w:t>
+              <w:t xml:space="preserve">ويُقدَّر</w:t>
             </w:r>
           </w:p>
         </w:tc>
@@ -7488,7 +7488,7 @@
                 <w:szCs w:val="20"/>
                 <w:rFonts w:ascii="Arial" w:cs="Arial" w:eastAsia="Arial" w:hAnsi="Arial"/>
               </w:rPr>
-              <w:t xml:space="preserve">مدارسنا</w:t>
+              <w:t xml:space="preserve">مدارس</w:t>
             </w:r>
           </w:p>
         </w:tc>
@@ -7565,7 +7565,7 @@
                 <w:szCs w:val="20"/>
                 <w:rFonts w:ascii="Arial" w:cs="Arial" w:eastAsia="Arial" w:hAnsi="Arial"/>
               </w:rPr>
-              <w:t xml:space="preserve">{{count}} مدارس عاملة اليوم،</w:t>
+              <w:t xml:space="preserve">{{count}} مدرسة قائمة اليوم،</w:t>
             </w:r>
           </w:p>
         </w:tc>
@@ -7642,7 +7642,7 @@
                 <w:szCs w:val="20"/>
                 <w:rFonts w:ascii="Arial" w:cs="Arial" w:eastAsia="Arial" w:hAnsi="Arial"/>
               </w:rPr>
-              <w:t xml:space="preserve">ومنطقةٌ في طور التكوين.</w:t>
+              <w:t xml:space="preserve">شبكة إقليمية تتوسع للمستقبل</w:t>
             </w:r>
           </w:p>
         </w:tc>
@@ -7873,7 +7873,7 @@
                 <w:szCs w:val="20"/>
                 <w:rFonts w:ascii="Arial" w:cs="Arial" w:eastAsia="Arial" w:hAnsi="Arial"/>
               </w:rPr>
-              <w:t xml:space="preserve">مزيدٌ من المدارس</w:t>
+              <w:t xml:space="preserve">المزيد من المدارس</w:t>
             </w:r>
           </w:p>
         </w:tc>
@@ -8027,7 +8027,7 @@
                 <w:szCs w:val="20"/>
                 <w:rFonts w:ascii="Arial" w:cs="Arial" w:eastAsia="Arial" w:hAnsi="Arial"/>
               </w:rPr>
-              <w:t xml:space="preserve">افتتاحٌ قريب</w:t>
+              <w:t xml:space="preserve">الافتتاح قريباً</w:t>
             </w:r>
           </w:p>
         </w:tc>
@@ -8181,7 +8181,7 @@
                 <w:szCs w:val="20"/>
                 <w:rFonts w:ascii="Arial" w:cs="Arial" w:eastAsia="Arial" w:hAnsi="Arial"/>
               </w:rPr>
-              <w:t xml:space="preserve">عرض المدرسة</w:t>
+              <w:t xml:space="preserve">استكشف المدرسة</w:t>
             </w:r>
           </w:p>
         </w:tc>
@@ -8258,7 +8258,7 @@
                 <w:szCs w:val="20"/>
                 <w:rFonts w:ascii="Arial" w:cs="Arial" w:eastAsia="Arial" w:hAnsi="Arial"/>
               </w:rPr>
-              <w:t xml:space="preserve">مزيدٌ من المدارس تنضمّ إلى الشبكة</w:t>
+              <w:t xml:space="preserve">مدارس جديدة تنضم إلى شبكتنا</w:t>
             </w:r>
           </w:p>
         </w:tc>
@@ -8335,7 +8335,7 @@
                 <w:szCs w:val="20"/>
                 <w:rFonts w:ascii="Arial" w:cs="Arial" w:eastAsia="Arial" w:hAnsi="Arial"/>
               </w:rPr>
-              <w:t xml:space="preserve">قريبًا</w:t>
+              <w:t xml:space="preserve">قريباً</w:t>
             </w:r>
           </w:p>
         </w:tc>
@@ -8412,7 +8412,7 @@
                 <w:szCs w:val="20"/>
                 <w:rFonts w:ascii="Arial" w:cs="Arial" w:eastAsia="Arial" w:hAnsi="Arial"/>
               </w:rPr>
-              <w:t xml:space="preserve">مدارس جديدة تنضمّ إلى الشبكة</w:t>
+              <w:t xml:space="preserve">مدارس جديدة تنضم إلى شبكتنا</w:t>
             </w:r>
           </w:p>
         </w:tc>
@@ -8489,7 +8489,7 @@
                 <w:szCs w:val="20"/>
                 <w:rFonts w:ascii="Arial" w:cs="Arial" w:eastAsia="Arial" w:hAnsi="Arial"/>
               </w:rPr>
-              <w:t xml:space="preserve">استكشف الكل</w:t>
+              <w:t xml:space="preserve">استكشف جميع المدارس</w:t>
             </w:r>
           </w:p>
         </w:tc>
@@ -8789,7 +8789,7 @@
                 <w:szCs w:val="20"/>
                 <w:rFonts w:ascii="Arial" w:cs="Arial" w:eastAsia="Arial" w:hAnsi="Arial"/>
               </w:rPr>
-              <w:t xml:space="preserve">أثرٌ مستدام يتجاوز حدود الفصل الدراسي.</w:t>
+              <w:t xml:space="preserve">أثر مستدام يمتد إلى ما هو أبعد من الفصول الدراسية.</w:t>
             </w:r>
           </w:p>
         </w:tc>
@@ -8866,7 +8866,7 @@
                 <w:szCs w:val="20"/>
                 <w:rFonts w:ascii="Arial" w:cs="Arial" w:eastAsia="Arial" w:hAnsi="Arial"/>
               </w:rPr>
-              <w:t xml:space="preserve">تمكين المجتمعات وتوسيع الفرص من خلال التعليم.</w:t>
+              <w:t xml:space="preserve">نُمكّن المجتمعات ونفتح آفاقاً أوسع من خلال التعليم.</w:t>
             </w:r>
           </w:p>
         </w:tc>
@@ -8943,7 +8943,7 @@
                 <w:szCs w:val="20"/>
                 <w:rFonts w:ascii="Arial" w:cs="Arial" w:eastAsia="Arial" w:hAnsi="Arial"/>
               </w:rPr>
-              <w:t xml:space="preserve">اكتشف المؤسسة</w:t>
+              <w:t xml:space="preserve">اكتشف مؤسسة مدارك</w:t>
             </w:r>
           </w:p>
         </w:tc>
@@ -9097,7 +9097,7 @@
                 <w:szCs w:val="20"/>
                 <w:rFonts w:ascii="Arial" w:cs="Arial" w:eastAsia="Arial" w:hAnsi="Arial"/>
               </w:rPr>
-              <w:t xml:space="preserve">تعلّمٌ يتجاوز حدود الفصل الدراسي.</w:t>
+              <w:t xml:space="preserve">آفاق للتعلّم تتجاوز حدود الفصول الدراسية.</w:t>
             </w:r>
           </w:p>
         </w:tc>
@@ -9174,7 +9174,7 @@
                 <w:szCs w:val="20"/>
                 <w:rFonts w:ascii="Arial" w:cs="Arial" w:eastAsia="Arial" w:hAnsi="Arial"/>
               </w:rPr>
-              <w:t xml:space="preserve">برامج إثرائية وتجارب عالمية وبرامج قيادية للطلبة.</w:t>
+              <w:t xml:space="preserve">برامج إثرائية وتجارب عالمية وبرامج قيادية تسهم في تطوير مهارات الطلاب وتوسيع آفاقهم.</w:t>
             </w:r>
           </w:p>
         </w:tc>
@@ -9251,7 +9251,7 @@
                 <w:szCs w:val="20"/>
                 <w:rFonts w:ascii="Arial" w:cs="Arial" w:eastAsia="Arial" w:hAnsi="Arial"/>
               </w:rPr>
-              <w:t xml:space="preserve">داخل الأكاديمية</w:t>
+              <w:t xml:space="preserve">استكشف أكاديمية مدارك</w:t>
             </w:r>
           </w:p>
         </w:tc>
@@ -9457,7 +9457,7 @@
                 <w:szCs w:val="20"/>
                 <w:rFonts w:ascii="Arial" w:cs="Arial" w:eastAsia="Arial" w:hAnsi="Arial"/>
               </w:rPr>
-              <w:t xml:space="preserve">الصورة قريبًا</w:t>
+              <w:t xml:space="preserve">قريباً</w:t>
             </w:r>
           </w:p>
         </w:tc>
@@ -9534,7 +9534,7 @@
                 <w:szCs w:val="20"/>
                 <w:rFonts w:ascii="Arial" w:cs="Arial" w:eastAsia="Arial" w:hAnsi="Arial"/>
               </w:rPr>
-              <w:t xml:space="preserve">المركز الإعلامي</w:t>
+              <w:t xml:space="preserve">الإعلام</w:t>
             </w:r>
           </w:p>
         </w:tc>
@@ -9688,7 +9688,7 @@
                 <w:szCs w:val="20"/>
                 <w:rFonts w:ascii="Arial" w:cs="Arial" w:eastAsia="Arial" w:hAnsi="Arial"/>
               </w:rPr>
-              <w:t xml:space="preserve">المستجدّات.</w:t>
+              <w:t xml:space="preserve">المستجدات</w:t>
             </w:r>
           </w:p>
         </w:tc>
@@ -9765,7 +9765,7 @@
                 <w:szCs w:val="20"/>
                 <w:rFonts w:ascii="Arial" w:cs="Arial" w:eastAsia="Arial" w:hAnsi="Arial"/>
               </w:rPr>
-              <w:t xml:space="preserve">عرض كل المستجدّات ({{count}})</w:t>
+              <w:t xml:space="preserve">استعرض جميع المستجدات</w:t>
             </w:r>
           </w:p>
         </w:tc>
@@ -9842,7 +9842,7 @@
                 <w:szCs w:val="20"/>
                 <w:rFonts w:ascii="Arial" w:cs="Arial" w:eastAsia="Arial" w:hAnsi="Arial"/>
               </w:rPr>
-              <w:t xml:space="preserve">إعلاناتٌ وإنجازاتٌ وقصصٌ من مختلف أنحاء شبكة مدارك.</w:t>
+              <w:t xml:space="preserve">أبرز الإعلانات والإنجازات والقصص من مختلف أنحاء شبكة مدارك.</w:t>
             </w:r>
           </w:p>
         </w:tc>
@@ -9919,7 +9919,7 @@
                 <w:szCs w:val="20"/>
                 <w:rFonts w:ascii="Arial" w:cs="Arial" w:eastAsia="Arial" w:hAnsi="Arial"/>
               </w:rPr>
-              <w:t xml:space="preserve">اقرأ المزيد</w:t>
+              <w:t xml:space="preserve">اقرأ المزيد.</w:t>
             </w:r>
           </w:p>
         </w:tc>
@@ -10202,7 +10202,7 @@
                 <w:szCs w:val="20"/>
                 <w:rFonts w:ascii="Arial" w:cs="Arial" w:eastAsia="Arial" w:hAnsi="Arial"/>
               </w:rPr>
-              <w:t xml:space="preserve">لِنصنع المستقبل</w:t>
+              <w:t xml:space="preserve">معاً، نصنع المستقبل</w:t>
             </w:r>
           </w:p>
         </w:tc>
@@ -10356,7 +10356,7 @@
                 <w:szCs w:val="20"/>
                 <w:rFonts w:ascii="Arial" w:cs="Arial" w:eastAsia="Arial" w:hAnsi="Arial"/>
               </w:rPr>
-              <w:t xml:space="preserve">سواء كنت وليّ أمرٍ أو معلّمًا أو مؤسسةً أو شريكًا استراتيجيًا، نرحّب بالتواصل معك لاستكشاف سبل صناعة تجارب تعليمية ذات معنى معًا.</w:t>
+              <w:t xml:space="preserve">سواء كنت ولي أمر، أو تربوياً، أو تمثل مؤسسة أو شريكاً استراتيجياً، يسعدنا التواصل معك واستكشاف فرص التعاون لبناء تجارب تعليمية هادفة ومؤثرة معاً.</w:t>
             </w:r>
           </w:p>
         </w:tc>
@@ -10751,7 +10751,7 @@
                 <w:szCs w:val="20"/>
                 <w:rFonts w:ascii="Arial" w:cs="Arial" w:eastAsia="Arial" w:hAnsi="Arial"/>
               </w:rPr>
-              <w:t xml:space="preserve">منصّة تعليمية</w:t>
+              <w:t xml:space="preserve">منصة تعليمية إقليمية.</w:t>
             </w:r>
           </w:p>
         </w:tc>
@@ -10905,7 +10905,7 @@
                 <w:szCs w:val="20"/>
                 <w:rFonts w:ascii="Arial" w:cs="Arial" w:eastAsia="Arial" w:hAnsi="Arial"/>
               </w:rPr>
-              <w:t xml:space="preserve">شبكة متنامية من المدارس العالمية في أنحاء دول مجلس التعاون الخليجي، تقوم على التميّز الأكاديمي وإعداد طلبة واثقين متكاملي الشخصية.</w:t>
+              <w:t xml:space="preserve">شبكة متنامية من المدارس الدولية في دول مجلس التعاون الخليجي، ترتكز على التميز الأكاديمي وتنمية جيل من الطلاب الواثقين بأنفسهم والمتكاملين في معارفهم ومهاراتهم وشخصياتهم.</w:t>
             </w:r>
           </w:p>
         </w:tc>
@@ -11111,7 +11111,7 @@
                 <w:szCs w:val="20"/>
                 <w:rFonts w:ascii="Arial" w:cs="Arial" w:eastAsia="Arial" w:hAnsi="Arial"/>
               </w:rPr>
-              <w:t xml:space="preserve">قصّتنا</w:t>
+              <w:t xml:space="preserve">قصتنا</w:t>
             </w:r>
           </w:p>
         </w:tc>
@@ -11188,7 +11188,7 @@
                 <w:szCs w:val="20"/>
                 <w:rFonts w:ascii="Arial" w:cs="Arial" w:eastAsia="Arial" w:hAnsi="Arial"/>
               </w:rPr>
-              <w:t xml:space="preserve">نجمع المدارس معًا في أنحاء الخليج.</w:t>
+              <w:t xml:space="preserve">نجمع مدارس المنطقة تحت مظلة تعليمية واحدة.</w:t>
             </w:r>
           </w:p>
         </w:tc>
@@ -11265,7 +11265,7 @@
                 <w:szCs w:val="20"/>
                 <w:rFonts w:ascii="Arial" w:cs="Arial" w:eastAsia="Arial" w:hAnsi="Arial"/>
               </w:rPr>
-              <w:t xml:space="preserve">تجمع مدارك شبكة متنامية من المدارس في أنحاء دول مجلس التعاون الخليجي. ومن أولى مدارسنا في الإمارات والسعودية، نواصل التوسّع بدافع رسالةٍ واحدة: تقديم تعليمٍ معتمد عالميًا يُعِدّ طلبةً متكاملي الشخصية ويعزّز المجتمعات التي نخدمها.</w:t>
+              <w:t xml:space="preserve">تجمع مدارك شبكة متنامية من المدارس في دول مجلس التعاون الخليجي. وانطلاقاً من مدارسنا الأولى في دولة الإمارات العربية المتحدة والمملكة العربية السعودية، نواصل التوسع برؤية واضحة ورسالة واحدة: تقديم تعليم بمعايير دولية يسهم في بناء طلاب متكاملين في معارفهم ومهاراتهم وشخصياتهم، ويعزز أثرنا الإيجابي في المجتمعات التي نخدمها.</w:t>
             </w:r>
           </w:p>
         </w:tc>
@@ -11548,6 +11548,160 @@
                 <w:szCs w:val="20"/>
                 <w:rFonts w:ascii="Arial" w:cs="Arial" w:eastAsia="Arial" w:hAnsi="Arial"/>
               </w:rPr>
+              <w:t xml:space="preserve">الرؤية و</w:t>
+            </w:r>
+          </w:p>
+        </w:tc>
+      </w:tr>
+      <w:tr>
+        <w:tc>
+          <w:tcPr>
+            <w:tcW w:type="dxa" w:w="2500"/>
+            <w:tcMar>
+              <w:top w:type="dxa" w:w="40"/>
+              <w:left w:type="dxa" w:w="90"/>
+              <w:bottom w:type="dxa" w:w="40"/>
+              <w:right w:type="dxa" w:w="90"/>
+            </w:tcMar>
+          </w:tcPr>
+          <w:p>
+            <w:pPr>
+              <w:bidi w:val="false"/>
+              <w:jc w:val="left"/>
+            </w:pPr>
+            <w:r>
+              <w:rPr>
+                <w:color w:val="333333"/>
+                <w:sz w:val="16"/>
+                <w:szCs w:val="16"/>
+                <w:rFonts w:ascii="Consolas" w:cs="Consolas" w:eastAsia="Consolas" w:hAnsi="Consolas"/>
+              </w:rPr>
+              <w:t xml:space="preserve">about.visionMission.titleLine2</w:t>
+            </w:r>
+          </w:p>
+        </w:tc>
+        <w:tc>
+          <w:tcPr>
+            <w:tcW w:type="dxa" w:w="4960"/>
+            <w:tcMar>
+              <w:top w:type="dxa" w:w="40"/>
+              <w:left w:type="dxa" w:w="90"/>
+              <w:bottom w:type="dxa" w:w="40"/>
+              <w:right w:type="dxa" w:w="90"/>
+            </w:tcMar>
+          </w:tcPr>
+          <w:p>
+            <w:pPr>
+              <w:bidi w:val="false"/>
+              <w:jc w:val="left"/>
+            </w:pPr>
+            <w:r>
+              <w:rPr>
+                <w:sz w:val="18"/>
+                <w:szCs w:val="18"/>
+              </w:rPr>
+              <w:t xml:space="preserve">mission.</w:t>
+            </w:r>
+          </w:p>
+        </w:tc>
+        <w:tc>
+          <w:tcPr>
+            <w:tcW w:type="dxa" w:w="1900"/>
+            <w:tcMar>
+              <w:top w:type="dxa" w:w="40"/>
+              <w:left w:type="dxa" w:w="90"/>
+              <w:bottom w:type="dxa" w:w="40"/>
+              <w:right w:type="dxa" w:w="90"/>
+            </w:tcMar>
+          </w:tcPr>
+          <w:p>
+            <w:pPr>
+              <w:bidi/>
+              <w:jc w:val="right"/>
+            </w:pPr>
+            <w:r>
+              <w:rPr>
+                <w:sz w:val="20"/>
+                <w:szCs w:val="20"/>
+                <w:rFonts w:ascii="Arial" w:cs="Arial" w:eastAsia="Arial" w:hAnsi="Arial"/>
+              </w:rPr>
+              <w:t xml:space="preserve">الرسالة</w:t>
+            </w:r>
+          </w:p>
+        </w:tc>
+      </w:tr>
+      <w:tr>
+        <w:tc>
+          <w:tcPr>
+            <w:tcW w:type="dxa" w:w="2500"/>
+            <w:tcMar>
+              <w:top w:type="dxa" w:w="40"/>
+              <w:left w:type="dxa" w:w="90"/>
+              <w:bottom w:type="dxa" w:w="40"/>
+              <w:right w:type="dxa" w:w="90"/>
+            </w:tcMar>
+          </w:tcPr>
+          <w:p>
+            <w:pPr>
+              <w:bidi w:val="false"/>
+              <w:jc w:val="left"/>
+            </w:pPr>
+            <w:r>
+              <w:rPr>
+                <w:color w:val="333333"/>
+                <w:sz w:val="16"/>
+                <w:szCs w:val="16"/>
+                <w:rFonts w:ascii="Consolas" w:cs="Consolas" w:eastAsia="Consolas" w:hAnsi="Consolas"/>
+              </w:rPr>
+              <w:t xml:space="preserve">about.visionMission.visionLabel</w:t>
+            </w:r>
+          </w:p>
+        </w:tc>
+        <w:tc>
+          <w:tcPr>
+            <w:tcW w:type="dxa" w:w="4960"/>
+            <w:tcMar>
+              <w:top w:type="dxa" w:w="40"/>
+              <w:left w:type="dxa" w:w="90"/>
+              <w:bottom w:type="dxa" w:w="40"/>
+              <w:right w:type="dxa" w:w="90"/>
+            </w:tcMar>
+          </w:tcPr>
+          <w:p>
+            <w:pPr>
+              <w:bidi w:val="false"/>
+              <w:jc w:val="left"/>
+            </w:pPr>
+            <w:r>
+              <w:rPr>
+                <w:sz w:val="18"/>
+                <w:szCs w:val="18"/>
+              </w:rPr>
+              <w:t xml:space="preserve">Vision</w:t>
+            </w:r>
+          </w:p>
+        </w:tc>
+        <w:tc>
+          <w:tcPr>
+            <w:tcW w:type="dxa" w:w="1900"/>
+            <w:tcMar>
+              <w:top w:type="dxa" w:w="40"/>
+              <w:left w:type="dxa" w:w="90"/>
+              <w:bottom w:type="dxa" w:w="40"/>
+              <w:right w:type="dxa" w:w="90"/>
+            </w:tcMar>
+          </w:tcPr>
+          <w:p>
+            <w:pPr>
+              <w:bidi/>
+              <w:jc w:val="right"/>
+            </w:pPr>
+            <w:r>
+              <w:rPr>
+                <w:sz w:val="20"/>
+                <w:szCs w:val="20"/>
+                <w:rFonts w:ascii="Arial" w:cs="Arial" w:eastAsia="Arial" w:hAnsi="Arial"/>
+              </w:rPr>
               <w:t xml:space="preserve">الرؤية</w:t>
             </w:r>
           </w:p>
@@ -11576,160 +11730,6 @@
                 <w:szCs w:val="16"/>
                 <w:rFonts w:ascii="Consolas" w:cs="Consolas" w:eastAsia="Consolas" w:hAnsi="Consolas"/>
               </w:rPr>
-              <w:t xml:space="preserve">about.visionMission.titleLine2</w:t>
-            </w:r>
-          </w:p>
-        </w:tc>
-        <w:tc>
-          <w:tcPr>
-            <w:tcW w:type="dxa" w:w="4960"/>
-            <w:tcMar>
-              <w:top w:type="dxa" w:w="40"/>
-              <w:left w:type="dxa" w:w="90"/>
-              <w:bottom w:type="dxa" w:w="40"/>
-              <w:right w:type="dxa" w:w="90"/>
-            </w:tcMar>
-          </w:tcPr>
-          <w:p>
-            <w:pPr>
-              <w:bidi w:val="false"/>
-              <w:jc w:val="left"/>
-            </w:pPr>
-            <w:r>
-              <w:rPr>
-                <w:sz w:val="18"/>
-                <w:szCs w:val="18"/>
-              </w:rPr>
-              <w:t xml:space="preserve">mission.</w:t>
-            </w:r>
-          </w:p>
-        </w:tc>
-        <w:tc>
-          <w:tcPr>
-            <w:tcW w:type="dxa" w:w="1900"/>
-            <w:tcMar>
-              <w:top w:type="dxa" w:w="40"/>
-              <w:left w:type="dxa" w:w="90"/>
-              <w:bottom w:type="dxa" w:w="40"/>
-              <w:right w:type="dxa" w:w="90"/>
-            </w:tcMar>
-          </w:tcPr>
-          <w:p>
-            <w:pPr>
-              <w:bidi/>
-              <w:jc w:val="right"/>
-            </w:pPr>
-            <w:r>
-              <w:rPr>
-                <w:sz w:val="20"/>
-                <w:szCs w:val="20"/>
-                <w:rFonts w:ascii="Arial" w:cs="Arial" w:eastAsia="Arial" w:hAnsi="Arial"/>
-              </w:rPr>
-              <w:t xml:space="preserve">والرسالة.</w:t>
-            </w:r>
-          </w:p>
-        </w:tc>
-      </w:tr>
-      <w:tr>
-        <w:tc>
-          <w:tcPr>
-            <w:tcW w:type="dxa" w:w="2500"/>
-            <w:tcMar>
-              <w:top w:type="dxa" w:w="40"/>
-              <w:left w:type="dxa" w:w="90"/>
-              <w:bottom w:type="dxa" w:w="40"/>
-              <w:right w:type="dxa" w:w="90"/>
-            </w:tcMar>
-          </w:tcPr>
-          <w:p>
-            <w:pPr>
-              <w:bidi w:val="false"/>
-              <w:jc w:val="left"/>
-            </w:pPr>
-            <w:r>
-              <w:rPr>
-                <w:color w:val="333333"/>
-                <w:sz w:val="16"/>
-                <w:szCs w:val="16"/>
-                <w:rFonts w:ascii="Consolas" w:cs="Consolas" w:eastAsia="Consolas" w:hAnsi="Consolas"/>
-              </w:rPr>
-              <w:t xml:space="preserve">about.visionMission.visionLabel</w:t>
-            </w:r>
-          </w:p>
-        </w:tc>
-        <w:tc>
-          <w:tcPr>
-            <w:tcW w:type="dxa" w:w="4960"/>
-            <w:tcMar>
-              <w:top w:type="dxa" w:w="40"/>
-              <w:left w:type="dxa" w:w="90"/>
-              <w:bottom w:type="dxa" w:w="40"/>
-              <w:right w:type="dxa" w:w="90"/>
-            </w:tcMar>
-          </w:tcPr>
-          <w:p>
-            <w:pPr>
-              <w:bidi w:val="false"/>
-              <w:jc w:val="left"/>
-            </w:pPr>
-            <w:r>
-              <w:rPr>
-                <w:sz w:val="18"/>
-                <w:szCs w:val="18"/>
-              </w:rPr>
-              <w:t xml:space="preserve">Vision</w:t>
-            </w:r>
-          </w:p>
-        </w:tc>
-        <w:tc>
-          <w:tcPr>
-            <w:tcW w:type="dxa" w:w="1900"/>
-            <w:tcMar>
-              <w:top w:type="dxa" w:w="40"/>
-              <w:left w:type="dxa" w:w="90"/>
-              <w:bottom w:type="dxa" w:w="40"/>
-              <w:right w:type="dxa" w:w="90"/>
-            </w:tcMar>
-          </w:tcPr>
-          <w:p>
-            <w:pPr>
-              <w:bidi/>
-              <w:jc w:val="right"/>
-            </w:pPr>
-            <w:r>
-              <w:rPr>
-                <w:sz w:val="20"/>
-                <w:szCs w:val="20"/>
-                <w:rFonts w:ascii="Arial" w:cs="Arial" w:eastAsia="Arial" w:hAnsi="Arial"/>
-              </w:rPr>
-              <w:t xml:space="preserve">الرؤية</w:t>
-            </w:r>
-          </w:p>
-        </w:tc>
-      </w:tr>
-      <w:tr>
-        <w:tc>
-          <w:tcPr>
-            <w:tcW w:type="dxa" w:w="2500"/>
-            <w:tcMar>
-              <w:top w:type="dxa" w:w="40"/>
-              <w:left w:type="dxa" w:w="90"/>
-              <w:bottom w:type="dxa" w:w="40"/>
-              <w:right w:type="dxa" w:w="90"/>
-            </w:tcMar>
-          </w:tcPr>
-          <w:p>
-            <w:pPr>
-              <w:bidi w:val="false"/>
-              <w:jc w:val="left"/>
-            </w:pPr>
-            <w:r>
-              <w:rPr>
-                <w:color w:val="333333"/>
-                <w:sz w:val="16"/>
-                <w:szCs w:val="16"/>
-                <w:rFonts w:ascii="Consolas" w:cs="Consolas" w:eastAsia="Consolas" w:hAnsi="Consolas"/>
-              </w:rPr>
               <w:t xml:space="preserve">about.visionMission.vision</w:t>
             </w:r>
           </w:p>
@@ -11779,7 +11779,7 @@
                 <w:szCs w:val="20"/>
                 <w:rFonts w:ascii="Arial" w:cs="Arial" w:eastAsia="Arial" w:hAnsi="Arial"/>
               </w:rPr>
-              <w:t xml:space="preserve">أن نصبح منصّةً تعليمية رائدة يُشهَد لها بتقديم تجارب تعلّم استثنائية وخلق قيمة مستدامة في أنحاء المنطقة.</w:t>
+              <w:t xml:space="preserve">أن نكون منصة تعليمية رائدة على مستوى المنطقة، نتميّز بتقديم تجارب تعليمية استثنائية وصناعة قيمة مستدامة تمتد آثارها عبر الأجيال.</w:t>
             </w:r>
           </w:p>
         </w:tc>
@@ -11933,7 +11933,7 @@
                 <w:szCs w:val="20"/>
                 <w:rFonts w:ascii="Arial" w:cs="Arial" w:eastAsia="Arial" w:hAnsi="Arial"/>
               </w:rPr>
-              <w:t xml:space="preserve">أن نرعى الأجيال القادمة عبر تعليمٍ عالي الجودة وميسور المنال، يجمع بين التميّز الأكاديمي والابتكار وأفضل الممارسات العالمية.</w:t>
+              <w:t xml:space="preserve">الإسهام في بناء أجيال المستقبل من خلال توفير تعليم عالي الجودة ومتاح للجميع، يجمع بين التميز الأكاديمي والابتكار وأفضل الممارسات العالمية.</w:t>
             </w:r>
           </w:p>
         </w:tc>
@@ -12293,7 +12293,7 @@
                 <w:szCs w:val="20"/>
                 <w:rFonts w:ascii="Arial" w:cs="Arial" w:eastAsia="Arial" w:hAnsi="Arial"/>
               </w:rPr>
-              <w:t xml:space="preserve">واتجاه واحد.</w:t>
+              <w:t xml:space="preserve">ورؤية واحدة</w:t>
             </w:r>
           </w:p>
         </w:tc>
@@ -12447,7 +12447,7 @@
                 <w:szCs w:val="20"/>
                 <w:rFonts w:ascii="Arial" w:cs="Arial" w:eastAsia="Arial" w:hAnsi="Arial"/>
               </w:rPr>
-              <w:t xml:space="preserve">تقديم تجارب تعلّم عالية الجودة تُنمّي التحصيل الأكاديمي والتفكير الناقد والتنمية الشاملة.</w:t>
+              <w:t xml:space="preserve">تقديم تجارب تعليمية عالية الجودة تعزز التحصيل الأكاديمي، وتنمّي التفكير النقدي، وتدعم النمو المتكامل للطلاب.</w:t>
             </w:r>
           </w:p>
         </w:tc>
@@ -12524,7 +12524,7 @@
                 <w:szCs w:val="20"/>
                 <w:rFonts w:ascii="Arial" w:cs="Arial" w:eastAsia="Arial" w:hAnsi="Arial"/>
               </w:rPr>
-              <w:t xml:space="preserve">التحصيل الأكاديمي · التفكير الناقد · التنمية الشاملة</w:t>
+              <w:t xml:space="preserve">التحصيل الأكاديمي · التفكير النقدي · النمو المتكامل</w:t>
             </w:r>
           </w:p>
         </w:tc>
@@ -12678,7 +12678,7 @@
                 <w:szCs w:val="20"/>
                 <w:rFonts w:ascii="Arial" w:cs="Arial" w:eastAsia="Arial" w:hAnsi="Arial"/>
               </w:rPr>
-              <w:t xml:space="preserve">بناء بيئات تعلّم مواكبة للمستقبل تحتضن التقنية والإبداع والأساليب الحديثة في التعليم.</w:t>
+              <w:t xml:space="preserve">توفير بيئات تعليمية مواكبة للمستقبل، توظّف التكنولوجيا والإبداع وتتبنى أساليب مبتكرة في التعليم.</w:t>
             </w:r>
           </w:p>
         </w:tc>
@@ -12755,7 +12755,7 @@
                 <w:szCs w:val="20"/>
                 <w:rFonts w:ascii="Arial" w:cs="Arial" w:eastAsia="Arial" w:hAnsi="Arial"/>
               </w:rPr>
-              <w:t xml:space="preserve">التقنية · الإبداع · أساليب جديدة</w:t>
+              <w:t xml:space="preserve">التكنولوجيا · الإبداع · أساليب مبتكرة</w:t>
             </w:r>
           </w:p>
         </w:tc>
@@ -12832,7 +12832,7 @@
                 <w:szCs w:val="20"/>
                 <w:rFonts w:ascii="Arial" w:cs="Arial" w:eastAsia="Arial" w:hAnsi="Arial"/>
               </w:rPr>
-              <w:t xml:space="preserve">النمو الإقليمي</w:t>
+              <w:t xml:space="preserve">التوسع الإقليمي</w:t>
             </w:r>
           </w:p>
         </w:tc>
@@ -12909,7 +12909,7 @@
                 <w:szCs w:val="20"/>
                 <w:rFonts w:ascii="Arial" w:cs="Arial" w:eastAsia="Arial" w:hAnsi="Arial"/>
               </w:rPr>
-              <w:t xml:space="preserve">بناء منظومة تعليمية رائدة عبر التوسّع الاستراتيجي والشراكات والتعاون في أنحاء الخليج وخارجه.</w:t>
+              <w:t xml:space="preserve">بناء منظومة تعليمية رائدة من خلال التوسع الاستراتيجي، وبناء الشراكات، وتعزيز التعاون في دول مجلس التعاون الخليجي وخارجها.</w:t>
             </w:r>
           </w:p>
         </w:tc>
@@ -12986,7 +12986,7 @@
                 <w:szCs w:val="20"/>
                 <w:rFonts w:ascii="Arial" w:cs="Arial" w:eastAsia="Arial" w:hAnsi="Arial"/>
               </w:rPr>
-              <w:t xml:space="preserve">التوسّع الاستراتيجي · الشراكات · الخليج وما بعده</w:t>
+              <w:t xml:space="preserve">التوسع الاستراتيجي · الشراكات · دول مجلس التعاون الخليجي وخارجها</w:t>
             </w:r>
           </w:p>
         </w:tc>
@@ -13063,7 +13063,7 @@
                 <w:szCs w:val="20"/>
                 <w:rFonts w:ascii="Arial" w:cs="Arial" w:eastAsia="Arial" w:hAnsi="Arial"/>
               </w:rPr>
-              <w:t xml:space="preserve">أثرٌ مستدام</w:t>
+              <w:t xml:space="preserve">الأثر المستدام</w:t>
             </w:r>
           </w:p>
         </w:tc>
@@ -13140,7 +13140,7 @@
                 <w:szCs w:val="20"/>
                 <w:rFonts w:ascii="Arial" w:cs="Arial" w:eastAsia="Arial" w:hAnsi="Arial"/>
               </w:rPr>
-              <w:t xml:space="preserve">تحقيق نتائج إيجابية ومستدامة للطلبة والمعلّمين والمجتمعات والأجيال القادمة.</w:t>
+              <w:t xml:space="preserve">إحداث أثر إيجابي ومستدام في حياة الطلاب والتربويين والمجتمعات، يمتد إلى الأجيال القادمة.</w:t>
             </w:r>
           </w:p>
         </w:tc>
@@ -13217,7 +13217,7 @@
                 <w:szCs w:val="20"/>
                 <w:rFonts w:ascii="Arial" w:cs="Arial" w:eastAsia="Arial" w:hAnsi="Arial"/>
               </w:rPr>
-              <w:t xml:space="preserve">الطلبة والمعلّمون · المجتمعات · الأجيال القادمة</w:t>
+              <w:t xml:space="preserve">الطلاب والتربويون · المجتمعات · الأجيال القادمة</w:t>
             </w:r>
           </w:p>
         </w:tc>
@@ -13500,7 +13500,7 @@
                 <w:szCs w:val="20"/>
                 <w:rFonts w:ascii="Arial" w:cs="Arial" w:eastAsia="Arial" w:hAnsi="Arial"/>
               </w:rPr>
-              <w:t xml:space="preserve">التزامٌ تجاه</w:t>
+              <w:t xml:space="preserve">التزام راسخ بالتعلّم</w:t>
             </w:r>
           </w:p>
         </w:tc>
@@ -13577,7 +13577,7 @@
                 <w:szCs w:val="20"/>
                 <w:rFonts w:ascii="Arial" w:cs="Arial" w:eastAsia="Arial" w:hAnsi="Arial"/>
               </w:rPr>
-              <w:t xml:space="preserve">التعلّم مدى الحياة.</w:t>
+              <w:t xml:space="preserve">مدى الحياة</w:t>
             </w:r>
           </w:p>
         </w:tc>
@@ -13654,7 +13654,7 @@
                 <w:szCs w:val="20"/>
                 <w:rFonts w:ascii="Arial" w:cs="Arial" w:eastAsia="Arial" w:hAnsi="Arial"/>
               </w:rPr>
-              <w:t xml:space="preserve">في مدارك، نؤمن بأن التعليم الاستثنائي يتجاوز حدود التحصيل الأكاديمي. فنحن نسعى إلى إعداد أفرادٍ متكاملي الشخصية يمتلكون المهارات والقيم والعقلية اللازمة للنجاح في عالمٍ متغيّر.</w:t>
+              <w:t xml:space="preserve">في مدارك، نؤمن بأن التعليم المتميز يتجاوز حدود التحصيل الأكاديمي. ونسعى إلى بناء شخصيات متكاملة، تمتلك المهارات والقيم والعقلية اللازمة للنجاح ومواكبة عالم دائم التطور.</w:t>
             </w:r>
           </w:p>
         </w:tc>
@@ -13731,7 +13731,7 @@
                 <w:szCs w:val="20"/>
                 <w:rFonts w:ascii="Arial" w:cs="Arial" w:eastAsia="Arial" w:hAnsi="Arial"/>
               </w:rPr>
-              <w:t xml:space="preserve">تعلّمٌ محوره الطالب</w:t>
+              <w:t xml:space="preserve">التعلّم المتمحور حول الطالب</w:t>
             </w:r>
           </w:p>
         </w:tc>
@@ -13808,7 +13808,7 @@
                 <w:szCs w:val="20"/>
                 <w:rFonts w:ascii="Arial" w:cs="Arial" w:eastAsia="Arial" w:hAnsi="Arial"/>
               </w:rPr>
-              <w:t xml:space="preserve">وضع الطالب في قلب المسيرة التعليمية، وتهيئة بيئات تحفّز الفضول والإبداع والنمو الشخصي.</w:t>
+              <w:t xml:space="preserve">نضع الطالب في صميم الرحلة التعليمية، ونوفّر بيئات محفّزة تشجّع على الفضول والإبداع والنمو الشخصي.</w:t>
             </w:r>
           </w:p>
         </w:tc>
@@ -13962,7 +13962,7 @@
                 <w:szCs w:val="20"/>
                 <w:rFonts w:ascii="Arial" w:cs="Arial" w:eastAsia="Arial" w:hAnsi="Arial"/>
               </w:rPr>
-              <w:t xml:space="preserve">احتضان التقنية وأساليب التدريس الحديثة لإعداد المتعلّمين للمستقبل.</w:t>
+              <w:t xml:space="preserve">توظيف التكنولوجيا وأساليب التعليم الحديثة لإعداد الطلاب لمتطلبات المستقبل.</w:t>
             </w:r>
           </w:p>
         </w:tc>
@@ -14039,7 +14039,7 @@
                 <w:szCs w:val="20"/>
                 <w:rFonts w:ascii="Arial" w:cs="Arial" w:eastAsia="Arial" w:hAnsi="Arial"/>
               </w:rPr>
-              <w:t xml:space="preserve">معايير عالمية</w:t>
+              <w:t xml:space="preserve">المعايير العالمية</w:t>
             </w:r>
           </w:p>
         </w:tc>
@@ -14116,7 +14116,7 @@
                 <w:szCs w:val="20"/>
                 <w:rFonts w:ascii="Arial" w:cs="Arial" w:eastAsia="Arial" w:hAnsi="Arial"/>
               </w:rPr>
-              <w:t xml:space="preserve">تقديم مناهج وأفضل ممارسات معتمدة عالميًا تدعم التميّز الأكاديمي.</w:t>
+              <w:t xml:space="preserve">تقديم مناهج تعليمية معترف بها دولياً، وتطبيق أفضل الممارسات العالمية بما يعزز التميز الأكاديمي.</w:t>
             </w:r>
           </w:p>
         </w:tc>
@@ -14193,7 +14193,7 @@
                 <w:szCs w:val="20"/>
                 <w:rFonts w:ascii="Arial" w:cs="Arial" w:eastAsia="Arial" w:hAnsi="Arial"/>
               </w:rPr>
-              <w:t xml:space="preserve">تنمية شاملة</w:t>
+              <w:t xml:space="preserve">النمو المتكامل</w:t>
             </w:r>
           </w:p>
         </w:tc>
@@ -14270,7 +14270,7 @@
                 <w:szCs w:val="20"/>
                 <w:rFonts w:ascii="Arial" w:cs="Arial" w:eastAsia="Arial" w:hAnsi="Arial"/>
               </w:rPr>
-              <w:t xml:space="preserve">دعم النمو الأكاديمي والشخصي والاجتماعي والعاطفي لإعداد أفرادٍ متكاملي الشخصية.</w:t>
+              <w:t xml:space="preserve">دعم النمو الأكاديمي والشخصي والاجتماعي والعاطفي للطلاب، بما يسهم في بناء شخصيات متكاملة ومتوازنة.</w:t>
             </w:r>
           </w:p>
         </w:tc>
@@ -14588,7 +14588,7 @@
                 <w:szCs w:val="20"/>
                 <w:rFonts w:ascii="Arial" w:cs="Arial" w:eastAsia="Arial" w:hAnsi="Arial"/>
               </w:rPr>
-              <w:t xml:space="preserve">استثمارٌ في</w:t>
+              <w:t xml:space="preserve">نستثمر في</w:t>
             </w:r>
           </w:p>
         </w:tc>
@@ -14665,7 +14665,7 @@
                 <w:szCs w:val="20"/>
                 <w:rFonts w:ascii="Arial" w:cs="Arial" w:eastAsia="Arial" w:hAnsi="Arial"/>
               </w:rPr>
-              <w:t xml:space="preserve">التميّز التعليمي.</w:t>
+              <w:t xml:space="preserve">التميّز التعليمي</w:t>
             </w:r>
           </w:p>
         </w:tc>
@@ -14742,7 +14742,7 @@
                 <w:szCs w:val="20"/>
                 <w:rFonts w:ascii="Arial" w:cs="Arial" w:eastAsia="Arial" w:hAnsi="Arial"/>
               </w:rPr>
-              <w:t xml:space="preserve">توفّر مدارس مدارك بيئات تعلّم متنوّعة مصمّمة لرعاية التحصيل الأكاديمي والإبداع والنمو الشخصي.</w:t>
+              <w:t xml:space="preserve">توفر مدارس مدارك بيئات تعليمية متنوعة ومحفّزة، صُممت لتعزيز التحصيل الأكاديمي وتنمية الإبداع ودعم النمو الشخصي للطلاب.</w:t>
             </w:r>
           </w:p>
         </w:tc>
@@ -14965,7 +14965,7 @@
                 <w:szCs w:val="20"/>
                 <w:rFonts w:ascii="Arial" w:cs="Arial" w:eastAsia="Arial" w:hAnsi="Arial"/>
               </w:rPr>
-              <w:t xml:space="preserve">المدرسة غير موجودة.</w:t>
+              <w:t xml:space="preserve">لم يتم العثور على المدرسة.</w:t>
             </w:r>
           </w:p>
         </w:tc>
@@ -15119,7 +15119,7 @@
                 <w:szCs w:val="20"/>
                 <w:rFonts w:ascii="Arial" w:cs="Arial" w:eastAsia="Arial" w:hAnsi="Arial"/>
               </w:rPr>
-              <w:t xml:space="preserve">مسار التصفّح</w:t>
+              <w:t xml:space="preserve">مسار التنقل</w:t>
             </w:r>
           </w:p>
         </w:tc>
@@ -15273,7 +15273,7 @@
                 <w:szCs w:val="20"/>
                 <w:rFonts w:ascii="Arial" w:cs="Arial" w:eastAsia="Arial" w:hAnsi="Arial"/>
               </w:rPr>
-              <w:t xml:space="preserve">المنهج</w:t>
+              <w:t xml:space="preserve">المنهج الدراسي</w:t>
             </w:r>
           </w:p>
         </w:tc>
@@ -15350,7 +15350,7 @@
                 <w:szCs w:val="20"/>
                 <w:rFonts w:ascii="Arial" w:cs="Arial" w:eastAsia="Arial" w:hAnsi="Arial"/>
               </w:rPr>
-              <w:t xml:space="preserve">الصفوف</w:t>
+              <w:t xml:space="preserve">المراحل الدراسية</w:t>
             </w:r>
           </w:p>
         </w:tc>
@@ -15427,7 +15427,7 @@
                 <w:szCs w:val="20"/>
                 <w:rFonts w:ascii="Arial" w:cs="Arial" w:eastAsia="Arial" w:hAnsi="Arial"/>
               </w:rPr>
-              <w:t xml:space="preserve">الأعمار</w:t>
+              <w:t xml:space="preserve">الفئات العمرية</w:t>
             </w:r>
           </w:p>
         </w:tc>
@@ -15581,7 +15581,7 @@
                 <w:szCs w:val="20"/>
                 <w:rFonts w:ascii="Arial" w:cs="Arial" w:eastAsia="Arial" w:hAnsi="Arial"/>
               </w:rPr>
-              <w:t xml:space="preserve">الطاقة الاستيعابية المخطّطة</w:t>
+              <w:t xml:space="preserve">الطاقة الاستيعابية المخططة</w:t>
             </w:r>
           </w:p>
         </w:tc>
@@ -15658,7 +15658,7 @@
                 <w:szCs w:val="20"/>
                 <w:rFonts w:ascii="Arial" w:cs="Arial" w:eastAsia="Arial" w:hAnsi="Arial"/>
               </w:rPr>
-              <w:t xml:space="preserve">إجمالي الطلبة</w:t>
+              <w:t xml:space="preserve">إجمالي عدد الطلاب</w:t>
             </w:r>
           </w:p>
         </w:tc>
@@ -15889,7 +15889,7 @@
                 <w:szCs w:val="20"/>
                 <w:rFonts w:ascii="Arial" w:cs="Arial" w:eastAsia="Arial" w:hAnsi="Arial"/>
               </w:rPr>
-              <w:t xml:space="preserve">معرض صور المدرسة</w:t>
+              <w:t xml:space="preserve">صور المدرسة</w:t>
             </w:r>
           </w:p>
         </w:tc>
@@ -15966,7 +15966,7 @@
                 <w:szCs w:val="20"/>
                 <w:rFonts w:ascii="Arial" w:cs="Arial" w:eastAsia="Arial" w:hAnsi="Arial"/>
               </w:rPr>
-              <w:t xml:space="preserve">تواصل</w:t>
+              <w:t xml:space="preserve">التواصل</w:t>
             </w:r>
           </w:p>
         </w:tc>
@@ -16043,7 +16043,7 @@
                 <w:szCs w:val="20"/>
                 <w:rFonts w:ascii="Arial" w:cs="Arial" w:eastAsia="Arial" w:hAnsi="Arial"/>
               </w:rPr>
-              <w:t xml:space="preserve">هل أنت مهتمّ بـ</w:t>
+              <w:t xml:space="preserve">مهتم بـ</w:t>
             </w:r>
           </w:p>
         </w:tc>
@@ -16274,7 +16274,7 @@
                 <w:szCs w:val="20"/>
                 <w:rFonts w:ascii="Arial" w:cs="Arial" w:eastAsia="Arial" w:hAnsi="Arial"/>
               </w:rPr>
-              <w:t xml:space="preserve">تواصل مع القبول</w:t>
+              <w:t xml:space="preserve">تواصل مع قسم القبول</w:t>
             </w:r>
           </w:p>
         </w:tc>
@@ -16592,7 +16592,7 @@
                 <w:szCs w:val="20"/>
                 <w:rFonts w:ascii="Arial" w:cs="Arial" w:eastAsia="Arial" w:hAnsi="Arial"/>
               </w:rPr>
-              <w:t xml:space="preserve">نصنع أثرًا مستدامًا</w:t>
+              <w:t xml:space="preserve">نصنع بالتعليم أثراً يمتد</w:t>
             </w:r>
           </w:p>
         </w:tc>
@@ -16669,7 +16669,7 @@
                 <w:szCs w:val="20"/>
                 <w:rFonts w:ascii="Arial" w:cs="Arial" w:eastAsia="Arial" w:hAnsi="Arial"/>
               </w:rPr>
-              <w:t xml:space="preserve">عبر التعليم.</w:t>
+              <w:t xml:space="preserve">عبر الأجيال</w:t>
             </w:r>
           </w:p>
         </w:tc>
@@ -16746,7 +16746,7 @@
                 <w:szCs w:val="20"/>
                 <w:rFonts w:ascii="Arial" w:cs="Arial" w:eastAsia="Arial" w:hAnsi="Arial"/>
               </w:rPr>
-              <w:t xml:space="preserve">تمكين المجتمعات وتوسيع الفرص من خلال مبادرات وشراكات تعليمية ذات معنى.</w:t>
+              <w:t xml:space="preserve">نُمكّن المجتمعات ونوسّع آفاق الفرص من خلال مبادرات تعليمية هادفة وشراكات فاعلة تُحدث أثراً مستداماً.</w:t>
             </w:r>
           </w:p>
         </w:tc>
@@ -16900,7 +16900,7 @@
                 <w:szCs w:val="20"/>
                 <w:rFonts w:ascii="Arial" w:cs="Arial" w:eastAsia="Arial" w:hAnsi="Arial"/>
               </w:rPr>
-              <w:t xml:space="preserve">التعليم يغيّر الحياة.</w:t>
+              <w:t xml:space="preserve">بالتعليم، نصنع فرقاً في حياة الأفراد.</w:t>
             </w:r>
           </w:p>
         </w:tc>
@@ -16977,7 +16977,7 @@
                 <w:szCs w:val="20"/>
                 <w:rFonts w:ascii="Arial" w:cs="Arial" w:eastAsia="Arial" w:hAnsi="Arial"/>
               </w:rPr>
-              <w:t xml:space="preserve">تجسّد مؤسسة مدارك التزامنا بخلق أثرٍ إيجابي ومستدام يتجاوز حدود الفصل الدراسي. فمن خلال المبادرات التعليمية والانخراط المجتمعي والشراكات الاستراتيجية، نمكّن الأجيال القادمة ونُسهم في تنمية المجتمعات التي نخدمها، إيمانًا منّا بقدرة التعليم على تغيير الحياة.</w:t>
+              <w:t xml:space="preserve">تجسّد مؤسسة مدارك التزامنا بإحداث أثر إيجابي ومستدام يتجاوز حدود الفصول الدراسية. ومن خلال المبادرات التعليمية، والمشاركة المجتمعية، والشراكات الاستراتيجية، نسعى إلى تمكين أجيال المستقبل والإسهام في تنمية المجتمعات التي نخدمها، انطلاقاً من إيماننا الراسخ بقدرة التعليم على إحداث تغيير حقيقي في حياة الأفراد.</w:t>
             </w:r>
           </w:p>
         </w:tc>
@@ -17260,7 +17260,7 @@
                 <w:szCs w:val="20"/>
                 <w:rFonts w:ascii="Arial" w:cs="Arial" w:eastAsia="Arial" w:hAnsi="Arial"/>
               </w:rPr>
-              <w:t xml:space="preserve">مجالات تركيزنا.</w:t>
+              <w:t xml:space="preserve">مجالات تركيزنا</w:t>
             </w:r>
           </w:p>
         </w:tc>
@@ -17337,7 +17337,7 @@
                 <w:szCs w:val="20"/>
                 <w:rFonts w:ascii="Arial" w:cs="Arial" w:eastAsia="Arial" w:hAnsi="Arial"/>
               </w:rPr>
-              <w:t xml:space="preserve">خمسة مجالاتٍ تركّز فيها المؤسسة برامجها ومبادراتها وشراكاتها.</w:t>
+              <w:t xml:space="preserve">خمسة مجالات رئيسية تركز عليها مؤسسة مدارك من خلال برامجها ومبادراتها وشراكاتها.</w:t>
             </w:r>
           </w:p>
         </w:tc>
@@ -17491,7 +17491,7 @@
                 <w:szCs w:val="20"/>
                 <w:rFonts w:ascii="Arial" w:cs="Arial" w:eastAsia="Arial" w:hAnsi="Arial"/>
               </w:rPr>
-              <w:t xml:space="preserve">دعم المبادرات التي تعزّز فرص تعلّم شاملة وميسورة للأفراد والمجتمعات.</w:t>
+              <w:t xml:space="preserve">دعم المبادرات التي تعزز فرص الوصول إلى تعليم شامل ومتاح للأفراد والمجتمعات.</w:t>
             </w:r>
           </w:p>
         </w:tc>
@@ -17645,7 +17645,7 @@
                 <w:szCs w:val="20"/>
                 <w:rFonts w:ascii="Arial" w:cs="Arial" w:eastAsia="Arial" w:hAnsi="Arial"/>
               </w:rPr>
-              <w:t xml:space="preserve">الإسهام في البرامج التي تعزّز المجتمعات وتُحدث أثرًا اجتماعيًا مستدامًا وذا معنى.</w:t>
+              <w:t xml:space="preserve">الإسهام في البرامج التي تدعم تنمية المجتمعات وتُحدث أثراً اجتماعياً هادفاً ومستداماً.</w:t>
             </w:r>
           </w:p>
         </w:tc>
@@ -17722,7 +17722,7 @@
                 <w:szCs w:val="20"/>
                 <w:rFonts w:ascii="Arial" w:cs="Arial" w:eastAsia="Arial" w:hAnsi="Arial"/>
               </w:rPr>
-              <w:t xml:space="preserve">تمكين الطلبة</w:t>
+              <w:t xml:space="preserve">تمكين الطلاب</w:t>
             </w:r>
           </w:p>
         </w:tc>
@@ -17799,7 +17799,7 @@
                 <w:szCs w:val="20"/>
                 <w:rFonts w:ascii="Arial" w:cs="Arial" w:eastAsia="Arial" w:hAnsi="Arial"/>
               </w:rPr>
-              <w:t xml:space="preserve">تشجيع القيادة والإبداع والتعلّم مدى الحياة ليبلغ الطلبة كامل إمكاناتهم.</w:t>
+              <w:t xml:space="preserve">تعزيز مهارات القيادة والإبداع والتعلّم مدى الحياة، بما يمكّن الطلاب من تحقيق إمكاناتهم وتطلعاتهم.</w:t>
             </w:r>
           </w:p>
         </w:tc>
@@ -17876,7 +17876,7 @@
                 <w:szCs w:val="20"/>
                 <w:rFonts w:ascii="Arial" w:cs="Arial" w:eastAsia="Arial" w:hAnsi="Arial"/>
               </w:rPr>
-              <w:t xml:space="preserve">شراكاتٌ للخير</w:t>
+              <w:t xml:space="preserve">شراكات من أجل الأثر</w:t>
             </w:r>
           </w:p>
         </w:tc>
@@ -17953,7 +17953,7 @@
                 <w:szCs w:val="20"/>
                 <w:rFonts w:ascii="Arial" w:cs="Arial" w:eastAsia="Arial" w:hAnsi="Arial"/>
               </w:rPr>
-              <w:t xml:space="preserve">التعاون مع المؤسسات والجهات التي تشاركنا رؤية التغيير الإيجابي عبر التعليم.</w:t>
+              <w:t xml:space="preserve">التعاون مع المؤسسات والجهات التي تشاركنا رؤيتنا في إحداث تغيير إيجابي من خلال التعليم.</w:t>
             </w:r>
           </w:p>
         </w:tc>
@@ -18107,7 +18107,7 @@
                 <w:szCs w:val="20"/>
                 <w:rFonts w:ascii="Arial" w:cs="Arial" w:eastAsia="Arial" w:hAnsi="Arial"/>
               </w:rPr>
-              <w:t xml:space="preserve">خلق قيمة طويلة الأمد عبر مبادرات مسؤولة تبني مستقبلًا أفضل للأجيال القادمة.</w:t>
+              <w:t xml:space="preserve">صناعة قيمة طويلة الأمد من خلال مبادرات مسؤولة تسهم في بناء مستقبل أفضل للأجيال القادمة.</w:t>
             </w:r>
           </w:p>
         </w:tc>
@@ -18390,7 +18390,7 @@
                 <w:szCs w:val="20"/>
                 <w:rFonts w:ascii="Arial" w:cs="Arial" w:eastAsia="Arial" w:hAnsi="Arial"/>
               </w:rPr>
-              <w:t xml:space="preserve">كن جزءًا من العمل.</w:t>
+              <w:t xml:space="preserve">كن جزءاً من الأثر</w:t>
             </w:r>
           </w:p>
         </w:tc>
@@ -18467,7 +18467,7 @@
                 <w:szCs w:val="20"/>
                 <w:rFonts w:ascii="Arial" w:cs="Arial" w:eastAsia="Arial" w:hAnsi="Arial"/>
               </w:rPr>
-              <w:t xml:space="preserve">كن شريكًا لنا</w:t>
+              <w:t xml:space="preserve">كن شريكاً لنا</w:t>
             </w:r>
           </w:p>
         </w:tc>
@@ -18544,7 +18544,7 @@
                 <w:szCs w:val="20"/>
                 <w:rFonts w:ascii="Arial" w:cs="Arial" w:eastAsia="Arial" w:hAnsi="Arial"/>
               </w:rPr>
-              <w:t xml:space="preserve">للمؤسسات والجهات التي تنسجم رسالتها مع النهوض بالتعليم في أنحاء المنطقة.</w:t>
+              <w:t xml:space="preserve">للمؤسسات والجهات التي تتوافق رسالتها مع رؤيتنا في تطوير التعليم والارتقاء به على مستوى المنطقة.</w:t>
             </w:r>
           </w:p>
         </w:tc>
@@ -18621,7 +18621,7 @@
                 <w:szCs w:val="20"/>
                 <w:rFonts w:ascii="Arial" w:cs="Arial" w:eastAsia="Arial" w:hAnsi="Arial"/>
               </w:rPr>
-              <w:t xml:space="preserve">ادعم قضية</w:t>
+              <w:t xml:space="preserve">ادعم مبادرة</w:t>
             </w:r>
           </w:p>
         </w:tc>
@@ -18698,7 +18698,7 @@
                 <w:szCs w:val="20"/>
                 <w:rFonts w:ascii="Arial" w:cs="Arial" w:eastAsia="Arial" w:hAnsi="Arial"/>
               </w:rPr>
-              <w:t xml:space="preserve">ادعم المبادرات التي توسّع الإتاحة وتعزّز المجتمعات وتمكّن الطلبة.</w:t>
+              <w:t xml:space="preserve">ساهم في دعم المبادرات التي توسّع فرص الوصول إلى التعليم، وتعزز تنمية المجتمعات، وتمكّن الطلاب.</w:t>
             </w:r>
           </w:p>
         </w:tc>
@@ -18852,7 +18852,7 @@
                 <w:szCs w:val="20"/>
                 <w:rFonts w:ascii="Arial" w:cs="Arial" w:eastAsia="Arial" w:hAnsi="Arial"/>
               </w:rPr>
-              <w:t xml:space="preserve">للمعلّمين وصنّاع التغيير الذين يقدّمون برامج وأفكارًا للمجتمعات التي نخدمها.</w:t>
+              <w:t xml:space="preserve">للتربويين وصنّاع التغيير الراغبين في تقديم برامج وأفكار تسهم في خدمة المجتمعات التي نعمل فيها.</w:t>
             </w:r>
           </w:p>
         </w:tc>
@@ -18929,7 +18929,7 @@
                 <w:szCs w:val="20"/>
                 <w:rFonts w:ascii="Arial" w:cs="Arial" w:eastAsia="Arial" w:hAnsi="Arial"/>
               </w:rPr>
-              <w:t xml:space="preserve">كن شريكًا للمؤسسة</w:t>
+              <w:t xml:space="preserve">شارك مؤسسة مدارك</w:t>
             </w:r>
           </w:p>
         </w:tc>
@@ -19247,7 +19247,7 @@
                 <w:szCs w:val="20"/>
                 <w:rFonts w:ascii="Arial" w:cs="Arial" w:eastAsia="Arial" w:hAnsi="Arial"/>
               </w:rPr>
-              <w:t xml:space="preserve">تعلّمٌ يتجاوز</w:t>
+              <w:t xml:space="preserve">تعلّم يتجاوز حدود الفصول الدراسية</w:t>
             </w:r>
           </w:p>
         </w:tc>
@@ -19401,7 +19401,7 @@
                 <w:szCs w:val="20"/>
                 <w:rFonts w:ascii="Arial" w:cs="Arial" w:eastAsia="Arial" w:hAnsi="Arial"/>
               </w:rPr>
-              <w:t xml:space="preserve">نُلهم الجيل القادم عبر برامج إثرائية وتجارب عالمية وفرص للتعلّم مدى الحياة.</w:t>
+              <w:t xml:space="preserve">نُلهم أجيال المستقبل من خلال البرامج الإثرائية، والتجارب العالمية، وفرص التعلّم المستمر مدى الحياة.</w:t>
             </w:r>
           </w:p>
         </w:tc>
@@ -19555,7 +19555,7 @@
                 <w:szCs w:val="20"/>
                 <w:rFonts w:ascii="Arial" w:cs="Arial" w:eastAsia="Arial" w:hAnsi="Arial"/>
               </w:rPr>
-              <w:t xml:space="preserve">منصّةٌ لإثراء الطلبة.</w:t>
+              <w:t xml:space="preserve">منصة لإثراء تجربة الطلاب</w:t>
             </w:r>
           </w:p>
         </w:tc>
@@ -19632,7 +19632,7 @@
                 <w:szCs w:val="20"/>
                 <w:rFonts w:ascii="Arial" w:cs="Arial" w:eastAsia="Arial" w:hAnsi="Arial"/>
               </w:rPr>
-              <w:t xml:space="preserve">أكاديمية مدارك منصّةٌ للإثراء وتطوير القيادة والتجارب التعاونية التي تمكّن الطلبة من استكشاف آفاقٍ جديدة وبلوغ كامل إمكاناتهم. وبتوسيع نطاق التعلّم خارج الفصول التقليدية، نُعِدّ الطلبة للنجاح في عالمٍ مترابط وسريع التغيّر.</w:t>
+              <w:t xml:space="preserve">أكاديمية مدارك هي منصة متخصصة في الإثراء التعليمي وتنمية المهارات القيادية وتقديم التجارب التعاونية، بما يمكّن الطلاب من استكشاف آفاق ووجهات نظر جديدة وتحقيق كامل إمكاناتهم.ومن خلال توسيع آفاق التعلّم إلى ما هو أبعد من الفصول الدراسية التقليدية، نُعدّ الطلاب للتميّز والنجاح في عالم مترابط ومتسارع التطور.</w:t>
             </w:r>
           </w:p>
         </w:tc>
@@ -19915,7 +19915,7 @@
                 <w:szCs w:val="20"/>
                 <w:rFonts w:ascii="Arial" w:cs="Arial" w:eastAsia="Arial" w:hAnsi="Arial"/>
               </w:rPr>
-              <w:t xml:space="preserve">ستّ طرقٍ للنمو.</w:t>
+              <w:t xml:space="preserve">ستة مسارات للنمو</w:t>
             </w:r>
           </w:p>
         </w:tc>
@@ -19992,7 +19992,7 @@
                 <w:szCs w:val="20"/>
                 <w:rFonts w:ascii="Arial" w:cs="Arial" w:eastAsia="Arial" w:hAnsi="Arial"/>
               </w:rPr>
-              <w:t xml:space="preserve">إثراءٌ يمتدّ بالتعلّم خارج الفصل الدراسي، عبر منظومة مدارك وحول العالم.</w:t>
+              <w:t xml:space="preserve">تجارب إثرائية توسّع آفاق التعلّم إلى ما هو أبعد من الفصول الدراسية، عبر منظومة مدارك وحول العالم.</w:t>
             </w:r>
           </w:p>
         </w:tc>
@@ -20146,7 +20146,7 @@
                 <w:szCs w:val="20"/>
                 <w:rFonts w:ascii="Arial" w:cs="Arial" w:eastAsia="Arial" w:hAnsi="Arial"/>
               </w:rPr>
-              <w:t xml:space="preserve">فرصٌ للتفاعل مع الأقران عبر منظومة مدارك وخارجها، بما يعزّز التفاهم الثقافي واتّساع الآفاق والمواطنة العالمية.</w:t>
+              <w:t xml:space="preserve">فرص تتيح للطلاب التواصل والتفاعل مع أقرانهم في مختلف مدارس منظومة مدارك وخارجها، بما يعزز التفاهم الثقافي، ويوسّع آفاقهم، وينمّي لديهم مفهوم المواطنة العالمية.</w:t>
             </w:r>
           </w:p>
         </w:tc>
@@ -20223,7 +20223,7 @@
                 <w:szCs w:val="20"/>
                 <w:rFonts w:ascii="Arial" w:cs="Arial" w:eastAsia="Arial" w:hAnsi="Arial"/>
               </w:rPr>
-              <w:t xml:space="preserve">تطوير القيادة</w:t>
+              <w:t xml:space="preserve">تنمية المهارات القيادية</w:t>
             </w:r>
           </w:p>
         </w:tc>
@@ -20300,7 +20300,7 @@
                 <w:szCs w:val="20"/>
                 <w:rFonts w:ascii="Arial" w:cs="Arial" w:eastAsia="Arial" w:hAnsi="Arial"/>
               </w:rPr>
-              <w:t xml:space="preserve">برامج إرشادية وورش عمل وتعلّم تجريبي تُنمّي الثقة والتعاون والمسؤولية لدى قادة المستقبل.</w:t>
+              <w:t xml:space="preserve">برامج إرشادية وورش عمل وتجارب تعليمية عملية تسهم في بناء الثقة، وتعزيز التعاون والمسؤولية، وإعداد قادة المستقبل.</w:t>
             </w:r>
           </w:p>
         </w:tc>
@@ -20454,7 +20454,7 @@
                 <w:szCs w:val="20"/>
                 <w:rFonts w:ascii="Arial" w:cs="Arial" w:eastAsia="Arial" w:hAnsi="Arial"/>
               </w:rPr>
-              <w:t xml:space="preserve">مبادرات تشجّع الإبداع والتفكير الناقد وحلّ المشكلات لإلهام الجيل القادم من المبتكرين وصنّاع التغيير.</w:t>
+              <w:t xml:space="preserve">مبادرات تحفّز الإبداع والتفكير النقدي ومهارات حل المشكلات، لإلهام جيل جديد من المبتكرين وصنّاع التغيير.</w:t>
             </w:r>
           </w:p>
         </w:tc>
@@ -20608,7 +20608,7 @@
                 <w:szCs w:val="20"/>
                 <w:rFonts w:ascii="Arial" w:cs="Arial" w:eastAsia="Arial" w:hAnsi="Arial"/>
               </w:rPr>
-              <w:t xml:space="preserve">مسابقات ومخيّمات تعليمية وورش عمل وبرامج متخصّصة تُكمّل التعليم الصفّي وتوسّعه.</w:t>
+              <w:t xml:space="preserve">مسابقات ومخيمات تعليمية وورش عمل وبرامج متخصصة تثري التجربة التعليمية وتوسّع نطاق التعلّم إلى ما هو أبعد من المناهج والفصول الدراسية.</w:t>
             </w:r>
           </w:p>
         </w:tc>
@@ -20762,7 +20762,7 @@
                 <w:szCs w:val="20"/>
                 <w:rFonts w:ascii="Arial" w:cs="Arial" w:eastAsia="Arial" w:hAnsi="Arial"/>
               </w:rPr>
-              <w:t xml:space="preserve">مبادرات ومشاريع وتجارب مشتركة تربط الطلبة والمعلّمين عبر منظومة مدارك.</w:t>
+              <w:t xml:space="preserve">مبادرات ومشاريع وتجارب مشتركة تجمع الطلاب والتربويين من مختلف مدارس منظومة مدارك، وتعزز تبادل المعرفة والخبرات فيما بينهم.</w:t>
             </w:r>
           </w:p>
         </w:tc>
@@ -20916,7 +20916,7 @@
                 <w:szCs w:val="20"/>
                 <w:rFonts w:ascii="Arial" w:cs="Arial" w:eastAsia="Arial" w:hAnsi="Arial"/>
               </w:rPr>
-              <w:t xml:space="preserve">شراكاتٌ مع مؤسسات وجهات رائدة تتيح فرصًا أوسع وانفتاحًا على أفضل الممارسات العالمية.</w:t>
+              <w:t xml:space="preserve">شراكات وتعاون مع مؤسسات وجهات رائدة تفتح آفاقاً أوسع أمام الطلاب، وتتيح لهم الاطلاع على أفضل الممارسات العالمية.</w:t>
             </w:r>
           </w:p>
         </w:tc>
@@ -21122,7 +21122,7 @@
                 <w:szCs w:val="20"/>
                 <w:rFonts w:ascii="Arial" w:cs="Arial" w:eastAsia="Arial" w:hAnsi="Arial"/>
               </w:rPr>
-              <w:t xml:space="preserve">لمن هذه الأكاديمية</w:t>
+              <w:t xml:space="preserve">الفئات المستهدفة</w:t>
             </w:r>
           </w:p>
         </w:tc>
@@ -21199,7 +21199,7 @@
                 <w:szCs w:val="20"/>
                 <w:rFonts w:ascii="Arial" w:cs="Arial" w:eastAsia="Arial" w:hAnsi="Arial"/>
               </w:rPr>
-              <w:t xml:space="preserve">مفتوحةٌ لكل طالبٍ في مدارك.</w:t>
+              <w:t xml:space="preserve">متاحة لجميع طلاب مدارك</w:t>
             </w:r>
           </w:p>
         </w:tc>
@@ -21276,7 +21276,7 @@
                 <w:szCs w:val="20"/>
                 <w:rFonts w:ascii="Arial" w:cs="Arial" w:eastAsia="Arial" w:hAnsi="Arial"/>
               </w:rPr>
-              <w:t xml:space="preserve">لمن هذه الأكاديمية</w:t>
+              <w:t xml:space="preserve">لمن تقدم الأكاديمية برامجها؟</w:t>
             </w:r>
           </w:p>
         </w:tc>
@@ -21353,7 +21353,7 @@
                 <w:szCs w:val="20"/>
                 <w:rFonts w:ascii="Arial" w:cs="Arial" w:eastAsia="Arial" w:hAnsi="Arial"/>
               </w:rPr>
-              <w:t xml:space="preserve">أكاديمية مدارك مفتوحةٌ للطلبة في مختلف مدارسنا وللمجتمع الأوسع، ببرامج مصمّمة لمختلف الأعمار والمراحل.</w:t>
+              <w:t xml:space="preserve">تستقبل أكاديمية مدارك الطلاب من مختلف مدارسنا ومن المجتمع الأوسع، من خلال برامج مصممة لتناسب فئات عمرية ومراحل تعليمية متنوعة.</w:t>
             </w:r>
           </w:p>
         </w:tc>
@@ -21507,7 +21507,7 @@
                 <w:szCs w:val="20"/>
                 <w:rFonts w:ascii="Arial" w:cs="Arial" w:eastAsia="Arial" w:hAnsi="Arial"/>
               </w:rPr>
-              <w:t xml:space="preserve">يُفتَح التسجيل قبل كل برنامج. للتعبير عن اهتمامك أو معرفة المزيد عن المواعيد وشروط الالتحاق، تواصل مع فريقنا.</w:t>
+              <w:t xml:space="preserve">يُفتح التسجيل قبل انطلاق كل برنامج. ولتسجيل اهتمامك أو لمعرفة المزيد حول المواعيد وشروط الأهلية، تواصل مع فريقنا.</w:t>
             </w:r>
           </w:p>
         </w:tc>
@@ -21584,7 +21584,7 @@
                 <w:szCs w:val="20"/>
                 <w:rFonts w:ascii="Arial" w:cs="Arial" w:eastAsia="Arial" w:hAnsi="Arial"/>
               </w:rPr>
-              <w:t xml:space="preserve">لنُلهم متعلّمين مدى الحياة وقادةً للمستقبل.</w:t>
+              <w:t xml:space="preserve">نُلهم متعلّمين مدى الحياة وقادة المستقبل</w:t>
             </w:r>
           </w:p>
         </w:tc>
@@ -21661,7 +21661,7 @@
                 <w:szCs w:val="20"/>
                 <w:rFonts w:ascii="Arial" w:cs="Arial" w:eastAsia="Arial" w:hAnsi="Arial"/>
               </w:rPr>
-              <w:t xml:space="preserve">عبر إتاحة تجارب تتجاوز حدود الفصل الدراسي وتُعِدّ الطلبة للنجاح في عالمٍ مترابط.</w:t>
+              <w:t xml:space="preserve">من خلال تقديم تجارب تتجاوز حدود الفصول الدراسية، وتسهم في إعداد الطلاب للنجاح والتميّز في عالم مترابط.</w:t>
             </w:r>
           </w:p>
         </w:tc>
@@ -21979,7 +21979,7 @@
                 <w:szCs w:val="20"/>
                 <w:rFonts w:ascii="Arial" w:cs="Arial" w:eastAsia="Arial" w:hAnsi="Arial"/>
               </w:rPr>
-              <w:t xml:space="preserve">تواصل</w:t>
+              <w:t xml:space="preserve">تواصل معنا</w:t>
             </w:r>
           </w:p>
         </w:tc>
@@ -22056,7 +22056,7 @@
                 <w:szCs w:val="20"/>
                 <w:rFonts w:ascii="Arial" w:cs="Arial" w:eastAsia="Arial" w:hAnsi="Arial"/>
               </w:rPr>
-              <w:t xml:space="preserve">لِنصنع المستقبل</w:t>
+              <w:t xml:space="preserve">معاً، نصنع المستقبل</w:t>
             </w:r>
           </w:p>
         </w:tc>
@@ -22210,7 +22210,7 @@
                 <w:szCs w:val="20"/>
                 <w:rFonts w:ascii="Arial" w:cs="Arial" w:eastAsia="Arial" w:hAnsi="Arial"/>
               </w:rPr>
-              <w:t xml:space="preserve">سواء كنت وليّ أمرٍ أو معلّمًا أو مؤسسةً أو شريكًا استراتيجيًا، نرحّب بالتواصل معك لاستكشاف سبل صناعة تجارب تعليمية ذات معنى معًا.</w:t>
+              <w:t xml:space="preserve">سواء كنت ولي أمر، أو تربوياً، أو تمثل مؤسسة أو شريكاً استراتيجياً، يسعدنا التواصل معك واستكشاف فرص التعاون لبناء تجارب تعليمية هادفة ومؤثرة معاً.</w:t>
             </w:r>
           </w:p>
         </w:tc>
@@ -22493,7 +22493,7 @@
                 <w:szCs w:val="20"/>
                 <w:rFonts w:ascii="Arial" w:cs="Arial" w:eastAsia="Arial" w:hAnsi="Arial"/>
               </w:rPr>
-              <w:t xml:space="preserve">شكرًا لك.</w:t>
+              <w:t xml:space="preserve">شكراً لتواصلك معنا</w:t>
             </w:r>
           </w:p>
         </w:tc>
@@ -22570,7 +22570,7 @@
                 <w:szCs w:val="20"/>
                 <w:rFonts w:ascii="Arial" w:cs="Arial" w:eastAsia="Arial" w:hAnsi="Arial"/>
               </w:rPr>
-              <w:t xml:space="preserve">رسالتك في طريقها إلينا. سيردّ عليك أحد أفراد فريقنا خلال يومَي عمل. وفي غضون ذلك، يمكنك أيضًا مراسلتنا على</w:t>
+              <w:t xml:space="preserve">تم استلام رسالتك بنجاح، وسيتواصل معك أحد أعضاء فريقنا خلال يومي عمل. وفي هذه الأثناء، يمكنك أيضاً التواصل معنا عبر:</w:t>
             </w:r>
           </w:p>
         </w:tc>
@@ -22647,7 +22647,7 @@
                 <w:szCs w:val="20"/>
                 <w:rFonts w:ascii="Arial" w:cs="Arial" w:eastAsia="Arial" w:hAnsi="Arial"/>
               </w:rPr>
-              <w:t xml:space="preserve">اسمك</w:t>
+              <w:t xml:space="preserve">الاسم</w:t>
             </w:r>
           </w:p>
         </w:tc>
@@ -22878,7 +22878,7 @@
                 <w:szCs w:val="20"/>
                 <w:rFonts w:ascii="Arial" w:cs="Arial" w:eastAsia="Arial" w:hAnsi="Arial"/>
               </w:rPr>
-              <w:t xml:space="preserve">وليّ أمر</w:t>
+              <w:t xml:space="preserve">ولي أمر</w:t>
             </w:r>
           </w:p>
         </w:tc>
@@ -22955,7 +22955,7 @@
                 <w:szCs w:val="20"/>
                 <w:rFonts w:ascii="Arial" w:cs="Arial" w:eastAsia="Arial" w:hAnsi="Arial"/>
               </w:rPr>
-              <w:t xml:space="preserve">معلّم</w:t>
+              <w:t xml:space="preserve">تربوي</w:t>
             </w:r>
           </w:p>
         </w:tc>
@@ -23263,7 +23263,7 @@
                 <w:szCs w:val="20"/>
                 <w:rFonts w:ascii="Arial" w:cs="Arial" w:eastAsia="Arial" w:hAnsi="Arial"/>
               </w:rPr>
-              <w:t xml:space="preserve">إرسال الرسالة ←</w:t>
+              <w:t xml:space="preserve">إرسال الرسالة</w:t>
             </w:r>
           </w:p>
         </w:tc>
@@ -23469,7 +23469,7 @@
                 <w:szCs w:val="20"/>
                 <w:rFonts w:ascii="Arial" w:cs="Arial" w:eastAsia="Arial" w:hAnsi="Arial"/>
               </w:rPr>
-              <w:t xml:space="preserve">تواصل مباشر</w:t>
+              <w:t xml:space="preserve">التواصل المباشر</w:t>
             </w:r>
           </w:p>
         </w:tc>
@@ -23623,7 +23623,7 @@
                 <w:szCs w:val="20"/>
                 <w:rFonts w:ascii="Arial" w:cs="Arial" w:eastAsia="Arial" w:hAnsi="Arial"/>
               </w:rPr>
-              <w:t xml:space="preserve">للأسئلة والمعلومات العامة، يُرجى التواصل مع فريقنا.</w:t>
+              <w:t xml:space="preserve">للاستفسارات العامة وطلب المعلومات، يُرجى التواصل مع فريقنا.</w:t>
             </w:r>
           </w:p>
         </w:tc>
@@ -23777,7 +23777,7 @@
                 <w:szCs w:val="20"/>
                 <w:rFonts w:ascii="Arial" w:cs="Arial" w:eastAsia="Arial" w:hAnsi="Arial"/>
               </w:rPr>
-              <w:t xml:space="preserve">مهتمٌّ بالتعاون مع مدارك؟ نرحّب بفرص بناء شراكات ذات معنى تنهض بالتعليم وتُحدث أثرًا مستدامًا.</w:t>
+              <w:t xml:space="preserve">هل ترغب في التعاون مع مدارك؟ نرحب بفرص بناء شراكات هادفة تسهم في تطوير التعليم وإحداث أثر مستدام.</w:t>
             </w:r>
           </w:p>
         </w:tc>
@@ -23931,7 +23931,7 @@
                 <w:szCs w:val="20"/>
                 <w:rFonts w:ascii="Arial" w:cs="Arial" w:eastAsia="Arial" w:hAnsi="Arial"/>
               </w:rPr>
-              <w:t xml:space="preserve">انضمّ إلينا في صناعة مستقبل التعليم.</w:t>
+              <w:t xml:space="preserve">انضم إلينا وساهم في صناعة مستقبل التعلّم.</w:t>
             </w:r>
           </w:p>
         </w:tc>
@@ -24008,7 +24008,7 @@
                 <w:szCs w:val="20"/>
                 <w:rFonts w:ascii="Arial" w:cs="Arial" w:eastAsia="Arial" w:hAnsi="Arial"/>
               </w:rPr>
-              <w:t xml:space="preserve">المواقع</w:t>
+              <w:t xml:space="preserve">مواقعنا</w:t>
             </w:r>
           </w:p>
         </w:tc>
@@ -24085,7 +24085,7 @@
                 <w:szCs w:val="20"/>
                 <w:rFonts w:ascii="Arial" w:cs="Arial" w:eastAsia="Arial" w:hAnsi="Arial"/>
               </w:rPr>
-              <w:t xml:space="preserve">دبي، الإمارات · الرياض، السعودية</w:t>
+              <w:t xml:space="preserve">دبي، الإمارات العربية المتحدة · الرياض، المملكة العربية السعودية</w:t>
             </w:r>
           </w:p>
         </w:tc>
@@ -24162,7 +24162,7 @@
                 <w:szCs w:val="20"/>
                 <w:rFonts w:ascii="Arial" w:cs="Arial" w:eastAsia="Arial" w:hAnsi="Arial"/>
               </w:rPr>
-              <w:t xml:space="preserve">وسائل التواصل</w:t>
+              <w:t xml:space="preserve">وسائل التواصل الاجتماعي</w:t>
             </w:r>
           </w:p>
         </w:tc>
@@ -24480,7 +24480,7 @@
                 <w:szCs w:val="20"/>
                 <w:rFonts w:ascii="Arial" w:cs="Arial" w:eastAsia="Arial" w:hAnsi="Arial"/>
               </w:rPr>
-              <w:t xml:space="preserve">مجلس</w:t>
+              <w:t xml:space="preserve">مجلس الإدارة</w:t>
             </w:r>
           </w:p>
         </w:tc>
@@ -24634,7 +24634,7 @@
                 <w:szCs w:val="20"/>
                 <w:rFonts w:ascii="Arial" w:cs="Arial" w:eastAsia="Arial" w:hAnsi="Arial"/>
               </w:rPr>
-              <w:t xml:space="preserve">إشرافٌ استراتيجي وحوكمة ورعاية على مستوى المجموعة.</w:t>
+              <w:t xml:space="preserve">الإشراف الاستراتيجي والحوكمة وتعزيز الإدارة الرشيدة على مستوى المجموعة.</w:t>
             </w:r>
           </w:p>
         </w:tc>
@@ -24942,7 +24942,7 @@
                 <w:szCs w:val="20"/>
                 <w:rFonts w:ascii="Arial" w:cs="Arial" w:eastAsia="Arial" w:hAnsi="Arial"/>
               </w:rPr>
-              <w:t xml:space="preserve">الأشخاص</w:t>
+              <w:t xml:space="preserve">الكفاءات التي تقود مدارسنا</w:t>
             </w:r>
           </w:p>
         </w:tc>
@@ -25096,7 +25096,7 @@
                 <w:szCs w:val="20"/>
                 <w:rFonts w:ascii="Arial" w:cs="Arial" w:eastAsia="Arial" w:hAnsi="Arial"/>
               </w:rPr>
-              <w:t xml:space="preserve">قيادةٌ تنفيذية توجّه نمو مدارك وعمليات المدارس واستراتيجية المنصّة التعليمية طويلة الأمد.</w:t>
+              <w:t xml:space="preserve">قيادات تنفيذية تقود مسيرة نمو مدارك، وتشرف على عمليات المدارس، وتوجّه الاستراتيجية طويلة الأمد للمنظومة التعليمية.</w:t>
             </w:r>
           </w:p>
         </w:tc>
@@ -25687,7 +25687,7 @@
                 <w:szCs w:val="20"/>
                 <w:rFonts w:ascii="Arial" w:cs="Arial" w:eastAsia="Arial" w:hAnsi="Arial"/>
               </w:rPr>
-              <w:t xml:space="preserve">يُعلَن لاحقًا</w:t>
+              <w:t xml:space="preserve">سيتم الإعلان عنه قريباً</w:t>
             </w:r>
           </w:p>
         </w:tc>
@@ -25764,7 +25764,7 @@
                 <w:szCs w:val="20"/>
                 <w:rFonts w:ascii="Arial" w:cs="Arial" w:eastAsia="Arial" w:hAnsi="Arial"/>
               </w:rPr>
-              <w:t xml:space="preserve">مقعدٌ في المجلس يُعلَن لاحقًا</w:t>
+              <w:t xml:space="preserve">سيتم الإعلان عن عضو مجلس الإدارة قريباً</w:t>
             </w:r>
           </w:p>
         </w:tc>
@@ -27177,7 +27177,7 @@
                 <w:szCs w:val="20"/>
                 <w:rFonts w:ascii="Arial" w:cs="Arial" w:eastAsia="Arial" w:hAnsi="Arial"/>
               </w:rPr>
-              <w:t xml:space="preserve">يقود مدارك السعودية في الاستراتيجية والعمليات والتوجّه المؤسسي.</w:t>
+              <w:t xml:space="preserve">يقود أعمال مدارك السعودية، ويشرف على استراتيجيتها وعملياتها وتوجهها المؤسسي.</w:t>
             </w:r>
           </w:p>
         </w:tc>
@@ -27408,7 +27408,7 @@
                 <w:szCs w:val="20"/>
                 <w:rFonts w:ascii="Arial" w:cs="Arial" w:eastAsia="Arial" w:hAnsi="Arial"/>
               </w:rPr>
-              <w:t xml:space="preserve">قيادةٌ استراتيجية وتشغيلية لمدارك الإمارات ومدرسة المعارف الأمريكية، بخبرةٍ تتجاوز 30 عامًا في تطوير المدارس عبر المنطقة.</w:t>
+              <w:t xml:space="preserve">يتولى القيادة الاستراتيجية والتشغيلية لمدارك الإمارات ومدرسة المعارف الأمريكية، مستنداً إلى خبرة تتجاوز 30 عاماً في تطوير المدارس والارتقاء بأدائها في المنطقة.</w:t>
             </w:r>
           </w:p>
         </w:tc>
@@ -27485,7 +27485,7 @@
                 <w:szCs w:val="20"/>
                 <w:rFonts w:ascii="Arial" w:cs="Arial" w:eastAsia="Arial" w:hAnsi="Arial"/>
               </w:rPr>
-              <w:t xml:space="preserve">بصفته الرئيس التنفيذي ومدير المدارس في مدارك الإمارات، يتولّى محمد حسين المتوّع القيادة الاستراتيجية والتشغيلية لمدرسة المعارف الأمريكية في دبي.</w:t>
+              <w:t xml:space="preserve">بصفته الرئيس التنفيذي ومدير المدارس في مدارك الإمارات، يتولى محمد حسين مطاوع مسؤولية القيادة الاستراتيجية والتشغيلية لمدرسة المعارف الأمريكية في دبي.</w:t>
             </w:r>
           </w:p>
         </w:tc>
@@ -27562,7 +27562,7 @@
                 <w:szCs w:val="20"/>
                 <w:rFonts w:ascii="Arial" w:cs="Arial" w:eastAsia="Arial" w:hAnsi="Arial"/>
               </w:rPr>
-              <w:t xml:space="preserve">وبخبرةٍ تتجاوز 30 عامًا في تطوير المدارس عبر الإمارات ومصر — منها 15 عامًا في المناصب القيادية العليا — يُعرَف بقدرته على بناء فرقٍ عالية الأداء وتحقيق تحسّنٍ مدرسي ملموس وترسيخ ثقافة التميّز في مجتمعات المدارس بأكملها.</w:t>
+              <w:t xml:space="preserve">ويمتلك خبرة تمتد لأكثر من 30 عاماً في تطوير المدارس في دولة الإمارات العربية المتحدة ومصر، منها 15 عاماً في مناصب قيادية عليا. وقد اكتسب خبرة واسعة في بناء فرق عمل عالية الأداء، وقيادة عمليات التطوير والتحسين المدرسي وفق نتائج قابلة للقياس، وترسيخ ثقافة التميز في مختلف مكونات المجتمع المدرسي.</w:t>
             </w:r>
           </w:p>
         </w:tc>
@@ -27639,7 +27639,7 @@
                 <w:szCs w:val="20"/>
                 <w:rFonts w:ascii="Arial" w:cs="Arial" w:eastAsia="Arial" w:hAnsi="Arial"/>
               </w:rPr>
-              <w:t xml:space="preserve">وفي عام 2025، حظي بجائزة الخدمة من لجنة نيو إنجلاند لاعتماد المدارس والكليات (NEASC) في مجال التعليم الدولي، وهي تكريمٌ عالمي مرموق لإسهاماته في التعليم الدولي. ومن أبرز إنجازاته، ارتقاؤه بمدرسة الزهور الخاصة من تقييم «مقبول» إلى «جيّد» وفق هيئة الشارقة للتعليم الخاص (SPEA)، بقيادة مجتمعٍ يضمّ أكثر من 3٬000 طالب و300 موظف عبر مسيرة تحسّنٍ متواصلة.</w:t>
+              <w:t xml:space="preserve">وفي عام 2025، حصل على جائزة الخدمة في التعليم الدولي من لجنة التعليم الدولي التابعة لجمعية نيو إنجلاند للمدارس والكليات (NEASC)، تقديراً لإسهاماته في مجال التعليم الدولي. ومن أبرز إنجازاته قيادة مدرسة الزهور الخاصة في رحلة تطوير متواصلة أسهمت في رفع تصنيفها من «مقبول» إلى «جيد» وفق تقييم هيئة الشارقة للتعليم الخاص (SPEA)، ضمن مجتمع مدرسي يضم أكثر من 3,000 طالب و300 موظف.</w:t>
             </w:r>
           </w:p>
         </w:tc>
@@ -27716,7 +27716,7 @@
                 <w:szCs w:val="20"/>
                 <w:rFonts w:ascii="Arial" w:cs="Arial" w:eastAsia="Arial" w:hAnsi="Arial"/>
               </w:rPr>
-              <w:t xml:space="preserve">ويمتلك خبرةً عميقة في الأطر التنظيمية بدولة الإمارات، بما في ذلك تفتيش هيئة المعرفة والتنمية البشرية (KHDA) وهيئة الشارقة للتعليم الخاص ووزارة التربية والتعليم، إلى جانب الاعتماد الدولي عبر NEASC وCognia. وقد عمل عضوًا في فرق الزيارة التابعة لـNEASC وترأّس زيارات اعتماد لمدارس دولية في الخليج وخارجه.</w:t>
+              <w:t xml:space="preserve">ويتمتع بخبرة عميقة في الأطر التنظيمية لقطاع التعليم في دولة الإمارات العربية المتحدة، بما في ذلك متطلبات وعمليات التفتيش والتقييم لدى هيئة المعرفة والتنمية البشرية (KHDA)، وهيئة الشارقة للتعليم الخاص (SPEA)، ووزارة التربية والتعليم (MOE)، إلى جانب خبرته في الاعتمادات الدولية من جمعية نيو إنجلاند للمدارس والكليات (NEASC) ومؤسسة Cognia. كما شارك عضواً في فرق الزيارات التقييمية التابعة لـ NEASC، وترأس زيارات اعتماد لمدارس دولية في منطقة الخليج وخارجها.</w:t>
             </w:r>
           </w:p>
         </w:tc>
@@ -27793,7 +27793,7 @@
                 <w:szCs w:val="20"/>
                 <w:rFonts w:ascii="Arial" w:cs="Arial" w:eastAsia="Arial" w:hAnsi="Arial"/>
               </w:rPr>
-              <w:t xml:space="preserve">ويحمل درجة الماجستير في الإدارة من جامعة لينكولن بالمملكة المتحدة، ودرجتَي بكالوريوس في التربية وفي إدارة الأعمال والتمويل من جامعة الإسكندرية، وهو مدير مدرسة مرخّص من وزارة التربية والتعليم بدولة الإمارات.</w:t>
+              <w:t xml:space="preserve">يحمل درجة الماجستير في الإدارة من جامعة لينكولن في المملكة المتحدة، ودرجتي بكالوريوس في التربية، وإدارة الأعمال والتمويل من جامعة الإسكندرية، كما يحمل ترخيص مدير مدرسة من وزارة التربية والتعليم في دولة الإمارات العربية المتحدة.</w:t>
             </w:r>
           </w:p>
         </w:tc>
@@ -27947,7 +27947,7 @@
                 <w:szCs w:val="20"/>
                 <w:rFonts w:ascii="Arial" w:cs="Arial" w:eastAsia="Arial" w:hAnsi="Arial"/>
               </w:rPr>
-              <w:t xml:space="preserve">الرئيس التنفيذي المالي بالإنابة وأمين سرّ المجلس</w:t>
+              <w:t xml:space="preserve">القائم بأعمال المدير المالي وأمين سر مجلس الإدارة</w:t>
             </w:r>
           </w:p>
         </w:tc>
@@ -28024,7 +28024,7 @@
                 <w:szCs w:val="20"/>
                 <w:rFonts w:ascii="Arial" w:cs="Arial" w:eastAsia="Arial" w:hAnsi="Arial"/>
               </w:rPr>
-              <w:t xml:space="preserve">محاسبٌ قانوني بخبرةٍ تتجاوز 25 عامًا في المالية والحوكمة، يشرف على الإدارة المالية والامتثال وشؤون المجلس.</w:t>
+              <w:t xml:space="preserve">محاسب قانوني يتمتع بخبرة تزيد على 25 عاماً في مجالي المالية والحوكمة، ويتولى الإشراف على الإدارة المالية والامتثال وشؤون مجلس الإدارة.</w:t>
             </w:r>
           </w:p>
         </w:tc>
@@ -28101,7 +28101,7 @@
                 <w:szCs w:val="20"/>
                 <w:rFonts w:ascii="Arial" w:cs="Arial" w:eastAsia="Arial" w:hAnsi="Arial"/>
               </w:rPr>
-              <w:t xml:space="preserve">محاسبٌ قانوني وعضوٌ في معهد المحاسبين القانونيين بالهند، يمتلك هاريس مويدين خبرةً تتجاوز 25 عامًا في المحاسبة والمالية وحوكمة الشركات.</w:t>
+              <w:t xml:space="preserve">هاريس محيي الدين محاسب قانوني وعضو في معهد المحاسبين القانونيين في الهند، ويتمتع بخبرة تزيد على 25 عاماً في المحاسبة والمالية والحوكمة المؤسسية.</w:t>
             </w:r>
           </w:p>
         </w:tc>
@@ -28178,7 +28178,7 @@
                 <w:szCs w:val="20"/>
                 <w:rFonts w:ascii="Arial" w:cs="Arial" w:eastAsia="Arial" w:hAnsi="Arial"/>
               </w:rPr>
-              <w:t xml:space="preserve">امتدّت مسيرته المهنية عبر مؤسسات مرموقة من بينها جامعة ICFAI ومجموعة أرينكو وشركة EXL. وقد انضمّ إلى مدارك عام 2013، ويشغل اليوم منصب الرئيس التنفيذي المالي بالإنابة وأمين سرّ المجلس، مشرفًا على الإدارة المالية والامتثال والحوكمة.</w:t>
+              <w:t xml:space="preserve">وتشمل مسيرته المهنية العمل لدى عدد من المؤسسات المرموقة، من بينها جامعة ICFAI ومجموعة Arenco وشركة EXL Inc. وانضم إلى مدارك في عام 2013، ويشغل حالياً منصب القائم بأعمال المدير المالي وأمين سر مجلس الإدارة، حيث يتولى الإشراف على الإدارة المالية والامتثال والحوكمة.</w:t>
             </w:r>
           </w:p>
         </w:tc>
@@ -28401,7 +28401,7 @@
                 <w:szCs w:val="20"/>
                 <w:rFonts w:ascii="Arial" w:cs="Arial" w:eastAsia="Arial" w:hAnsi="Arial"/>
               </w:rPr>
-              <w:t xml:space="preserve">الملكية</w:t>
+              <w:t xml:space="preserve">هيكل الملكية</w:t>
             </w:r>
           </w:p>
         </w:tc>
@@ -28632,7 +28632,7 @@
                 <w:szCs w:val="20"/>
                 <w:rFonts w:ascii="Arial" w:cs="Arial" w:eastAsia="Arial" w:hAnsi="Arial"/>
               </w:rPr>
-              <w:t xml:space="preserve">المؤسسات والشركاء المستثمرون في نمو مدارك المتواصل عبر المنطقة.</w:t>
+              <w:t xml:space="preserve">المؤسسات والشركاء الذين يساهمون في دعم مسيرة نمو مدارك وتوسعها المستمر في المنطقة.</w:t>
             </w:r>
           </w:p>
         </w:tc>
@@ -28709,7 +28709,7 @@
                 <w:szCs w:val="20"/>
                 <w:rFonts w:ascii="Arial" w:cs="Arial" w:eastAsia="Arial" w:hAnsi="Arial"/>
               </w:rPr>
-              <w:t xml:space="preserve">زيارة الموقع</w:t>
+              <w:t xml:space="preserve">زيارة الموقع الإلكتروني</w:t>
             </w:r>
           </w:p>
         </w:tc>
@@ -29259,7 +29259,7 @@
                 <w:szCs w:val="20"/>
                 <w:rFonts w:ascii="Arial" w:cs="Arial" w:eastAsia="Arial" w:hAnsi="Arial"/>
               </w:rPr>
-              <w:t xml:space="preserve">القيادي غير موجود.</w:t>
+              <w:t xml:space="preserve">لم يتم العثور على الملف القيادي.</w:t>
             </w:r>
           </w:p>
         </w:tc>
@@ -29336,7 +29336,7 @@
                 <w:szCs w:val="20"/>
                 <w:rFonts w:ascii="Arial" w:cs="Arial" w:eastAsia="Arial" w:hAnsi="Arial"/>
               </w:rPr>
-              <w:t xml:space="preserve">العودة إلى القيادة</w:t>
+              <w:t xml:space="preserve">العودة إلى فريق القيادة</w:t>
             </w:r>
           </w:p>
         </w:tc>
@@ -29567,7 +29567,7 @@
                 <w:szCs w:val="20"/>
                 <w:rFonts w:ascii="Arial" w:cs="Arial" w:eastAsia="Arial" w:hAnsi="Arial"/>
               </w:rPr>
-              <w:t xml:space="preserve">الفريق</w:t>
+              <w:t xml:space="preserve">فريقنا</w:t>
             </w:r>
           </w:p>
         </w:tc>
@@ -29644,7 +29644,7 @@
                 <w:szCs w:val="20"/>
                 <w:rFonts w:ascii="Arial" w:cs="Arial" w:eastAsia="Arial" w:hAnsi="Arial"/>
               </w:rPr>
-              <w:t xml:space="preserve">قياديون</w:t>
+              <w:t xml:space="preserve">قيادات أخرى.</w:t>
             </w:r>
           </w:p>
         </w:tc>
@@ -29798,7 +29798,7 @@
                 <w:szCs w:val="20"/>
                 <w:rFonts w:ascii="Arial" w:cs="Arial" w:eastAsia="Arial" w:hAnsi="Arial"/>
               </w:rPr>
-              <w:t xml:space="preserve">تعرّف على بقية</w:t>
+              <w:t xml:space="preserve">تعرّف على باقي أعضاء الفريق.</w:t>
             </w:r>
           </w:p>
         </w:tc>
@@ -29952,7 +29952,7 @@
                 <w:szCs w:val="20"/>
                 <w:rFonts w:ascii="Arial" w:cs="Arial" w:eastAsia="Arial" w:hAnsi="Arial"/>
               </w:rPr>
-              <w:t xml:space="preserve">عرض جميع القيادات</w:t>
+              <w:t xml:space="preserve">استعرض جميع القيادات</w:t>
             </w:r>
           </w:p>
         </w:tc>
@@ -30029,7 +30029,7 @@
                 <w:szCs w:val="20"/>
                 <w:rFonts w:ascii="Arial" w:cs="Arial" w:eastAsia="Arial" w:hAnsi="Arial"/>
               </w:rPr>
-              <w:t xml:space="preserve">اقرأ الملف الكامل</w:t>
+              <w:t xml:space="preserve">اقرأ السيرة كاملة</w:t>
             </w:r>
           </w:p>
         </w:tc>
@@ -30331,7 +30331,7 @@
                 <w:szCs w:val="20"/>
                 <w:rFonts w:ascii="Arial" w:cs="Arial" w:eastAsia="Arial" w:hAnsi="Arial"/>
               </w:rPr>
-              <w:t xml:space="preserve">ابقَ</w:t>
+              <w:t xml:space="preserve">ابقَ على اطلاع</w:t>
             </w:r>
           </w:p>
         </w:tc>
@@ -30716,7 +30716,7 @@
                 <w:szCs w:val="20"/>
                 <w:rFonts w:ascii="Arial" w:cs="Arial" w:eastAsia="Arial" w:hAnsi="Arial"/>
               </w:rPr>
-              <w:t xml:space="preserve">مزيدٌ من الأخبار</w:t>
+              <w:t xml:space="preserve">المزيد من الأخبار</w:t>
             </w:r>
           </w:p>
         </w:tc>
@@ -30793,7 +30793,7 @@
                 <w:szCs w:val="20"/>
                 <w:rFonts w:ascii="Arial" w:cs="Arial" w:eastAsia="Arial" w:hAnsi="Arial"/>
               </w:rPr>
-              <w:t xml:space="preserve">لا توجد أخبارٌ في هذا التصنيف بعد.</w:t>
+              <w:t xml:space="preserve">لا توجد أخبار ضمن هذه الفئة حالياً.</w:t>
             </w:r>
           </w:p>
         </w:tc>
@@ -31634,7 +31634,7 @@
                 <w:szCs w:val="20"/>
                 <w:rFonts w:ascii="Arial" w:cs="Arial" w:eastAsia="Arial" w:hAnsi="Arial"/>
               </w:rPr>
-              <w:t xml:space="preserve">المقال غير موجود.</w:t>
+              <w:t xml:space="preserve">لم يتم العثور على المقال.</w:t>
             </w:r>
           </w:p>
         </w:tc>
@@ -31865,7 +31865,7 @@
                 <w:szCs w:val="20"/>
                 <w:rFonts w:ascii="Arial" w:cs="Arial" w:eastAsia="Arial" w:hAnsi="Arial"/>
               </w:rPr>
-              <w:t xml:space="preserve">شاهد المقطع</w:t>
+              <w:t xml:space="preserve">شاهد الفيديو</w:t>
             </w:r>
           </w:p>
         </w:tc>
@@ -32244,7 +32244,7 @@
                 <w:szCs w:val="20"/>
                 <w:rFonts w:ascii="Arial" w:cs="Arial" w:eastAsia="Arial" w:hAnsi="Arial"/>
               </w:rPr>
-              <w:t xml:space="preserve">انضمّ إلى مستقبل</w:t>
+              <w:t xml:space="preserve">كن جزءاً من مستقبل التعليم</w:t>
             </w:r>
           </w:p>
         </w:tc>
@@ -32398,7 +32398,7 @@
                 <w:szCs w:val="20"/>
                 <w:rFonts w:ascii="Arial" w:cs="Arial" w:eastAsia="Arial" w:hAnsi="Arial"/>
               </w:rPr>
-              <w:t xml:space="preserve">نستقطب المواهب ونطوّرها ونمكّنها ممن يشاركوننا شغف التعليم والابتكار.</w:t>
+              <w:t xml:space="preserve">نستقطب الكفاءات المتميزة ونطوّرها ونمكّنها، ممن يشاركوننا شغفنا بالتعليم والابتكار.</w:t>
             </w:r>
           </w:p>
         </w:tc>
@@ -32475,7 +32475,7 @@
                 <w:szCs w:val="20"/>
                 <w:rFonts w:ascii="Arial" w:cs="Arial" w:eastAsia="Arial" w:hAnsi="Arial"/>
               </w:rPr>
-              <w:t xml:space="preserve">التقديم العام</w:t>
+              <w:t xml:space="preserve">طلب توظيف عام</w:t>
             </w:r>
           </w:p>
         </w:tc>
@@ -32552,7 +32552,7 @@
                 <w:szCs w:val="20"/>
                 <w:rFonts w:ascii="Arial" w:cs="Arial" w:eastAsia="Arial" w:hAnsi="Arial"/>
               </w:rPr>
-              <w:t xml:space="preserve">لم تجد</w:t>
+              <w:t xml:space="preserve">لم تجد الفرصة المناسبة لك؟</w:t>
             </w:r>
           </w:p>
         </w:tc>
@@ -32706,7 +32706,7 @@
                 <w:szCs w:val="20"/>
                 <w:rFonts w:ascii="Arial" w:cs="Arial" w:eastAsia="Arial" w:hAnsi="Arial"/>
               </w:rPr>
-              <w:t xml:space="preserve">نبحث دائمًا عن معلّمين ومهنيين موهوبين يشاركوننا رسالتنا. أرسل لنا سيرتك الذاتية وأخبرنا كيف تودّ أن تُسهم.</w:t>
+              <w:t xml:space="preserve">نبحث دائماً عن تربويين ومتخصصين موهوبين يشاركوننا رسالتنا وطموحنا. أرسل لنا سيرتك الذاتية وأخبرنا كيف يمكنك الإسهام في مسيرة مدارك.</w:t>
             </w:r>
           </w:p>
         </w:tc>
@@ -32783,7 +32783,7 @@
                 <w:szCs w:val="20"/>
                 <w:rFonts w:ascii="Arial" w:cs="Arial" w:eastAsia="Arial" w:hAnsi="Arial"/>
               </w:rPr>
-              <w:t xml:space="preserve">قدّم طلبك</w:t>
+              <w:t xml:space="preserve">تقديم طلب التوظيف</w:t>
             </w:r>
           </w:p>
         </w:tc>
@@ -33085,7 +33085,7 @@
                 <w:szCs w:val="20"/>
                 <w:rFonts w:ascii="Arial" w:cs="Arial" w:eastAsia="Arial" w:hAnsi="Arial"/>
               </w:rPr>
-              <w:t xml:space="preserve">ننمو في أنحاء</w:t>
+              <w:t xml:space="preserve">نتوسع في منطقة الخليج</w:t>
             </w:r>
           </w:p>
         </w:tc>
@@ -33239,7 +33239,7 @@
                 <w:szCs w:val="20"/>
                 <w:rFonts w:ascii="Arial" w:cs="Arial" w:eastAsia="Arial" w:hAnsi="Arial"/>
               </w:rPr>
-              <w:t xml:space="preserve">مدارس متميّزة في الإمارات والسعودية، لكلٍّ منها طابعها الخاص، وتجمعها منظومة مدارك، ومزيدٌ في الطريق.</w:t>
+              <w:t xml:space="preserve">مدارس متميزة في دولة الإمارات العربية المتحدة والمملكة العربية السعودية، لكل منها طابعها الخاص، وتجمعها جميعاً منظومة مدارك التعليمية، مع المزيد من المدارس المرتقبة.</w:t>
             </w:r>
           </w:p>
         </w:tc>
@@ -33547,7 +33547,7 @@
                 <w:szCs w:val="20"/>
                 <w:rFonts w:ascii="Arial" w:cs="Arial" w:eastAsia="Arial" w:hAnsi="Arial"/>
               </w:rPr>
-              <w:t xml:space="preserve">المناهج</w:t>
+              <w:t xml:space="preserve">المناهج التعليمية</w:t>
             </w:r>
           </w:p>
         </w:tc>
@@ -33701,7 +33701,7 @@
                 <w:szCs w:val="20"/>
                 <w:rFonts w:ascii="Arial" w:cs="Arial" w:eastAsia="Arial" w:hAnsi="Arial"/>
               </w:rPr>
-              <w:t xml:space="preserve">خريطة الخليج تُظهر {{count}} من مدارس مدارك</w:t>
+              <w:t xml:space="preserve">خريطة لمنطقة الخليج توضح مواقع {{count}} من مدارس مدارك</w:t>
             </w:r>
           </w:p>
         </w:tc>
@@ -33778,7 +33778,7 @@
                 <w:szCs w:val="20"/>
                 <w:rFonts w:ascii="Arial" w:cs="Arial" w:eastAsia="Arial" w:hAnsi="Arial"/>
               </w:rPr>
-              <w:t xml:space="preserve">عرض تفاصيل المدرسة ←</w:t>
+              <w:t xml:space="preserve">استعرض تفاصيل المدرسة</w:t>
             </w:r>
           </w:p>
         </w:tc>
@@ -34009,7 +34009,7 @@
                 <w:szCs w:val="20"/>
                 <w:rFonts w:ascii="Arial" w:cs="Arial" w:eastAsia="Arial" w:hAnsi="Arial"/>
               </w:rPr>
-              <w:t xml:space="preserve">{{value}} طالبًا</w:t>
+              <w:t xml:space="preserve">{{value}} طالب</w:t>
             </w:r>
           </w:p>
         </w:tc>
@@ -34411,7 +34411,7 @@
                 <w:szCs w:val="20"/>
                 <w:rFonts w:ascii="Arial" w:cs="Arial" w:eastAsia="Arial" w:hAnsi="Arial"/>
               </w:rPr>
-              <w:t xml:space="preserve">مدرسة تتبع المنهج الأمريكي في دبي، تأسست عام 1987 — تُعلّم الطلبة من المراحل المبكرة حتى المرحلة الثانوية وصولًا إلى دبلوم الثانوية الأمريكية.</w:t>
+              <w:t xml:space="preserve">مدرسة أمريكية في دبي تأسست عام 1987، وتقدم التعليم للطلاب من مرحلة الطفولة المبكرة حتى المرحلة الثانوية وصولاً إلى شهادة الثانوية الأمريكية.</w:t>
             </w:r>
           </w:p>
         </w:tc>
@@ -34488,7 +34488,7 @@
                 <w:szCs w:val="20"/>
                 <w:rFonts w:ascii="Arial" w:cs="Arial" w:eastAsia="Arial" w:hAnsi="Arial"/>
               </w:rPr>
-              <w:t xml:space="preserve">تأسست مدرسة المعارف الأمريكية عام 1987، وهي من أعرق المدارس الأمريكية في دبي. تقدّم منهجًا وفق المعايير الأمريكية من المراحل المبكرة حتى المرحلة الثانوية، بنهجٍ يقوم على التفكير المستقل والإبداع وحلّ المشكلات الواقعية — ضمن مجتمعٍ متسامح وشامل يجمع طلبةً من جنسيات متعددة.</w:t>
+              <w:t xml:space="preserve">تأسست مدرسة المعارف الأمريكية عام 1987، وتُعد من أعرق المدارس الأمريكية في دبي. وتقدم منهجاً تعليمياً متوافقاً مع المعايير الأمريكية من مرحلة الطفولة المبكرة حتى المرحلة الثانوية، ضمن نهج تعليمي يرتكز على التفكير المستقل والإبداع وحل المشكلات الواقعية، في بيئة مدرسية داعمة وشاملة تجمع طلاباً من جنسيات وثقافات متنوعة.</w:t>
             </w:r>
           </w:p>
         </w:tc>
@@ -34565,7 +34565,7 @@
                 <w:szCs w:val="20"/>
                 <w:rFonts w:ascii="Arial" w:cs="Arial" w:eastAsia="Arial" w:hAnsi="Arial"/>
               </w:rPr>
-              <w:t xml:space="preserve">تأسست عام 1987 — من أعرق المدارس الأمريكية في دبي</w:t>
+              <w:t xml:space="preserve">تأسست عام 1987، وتُعد من أعرق المدارس الأمريكية في دبي</w:t>
             </w:r>
           </w:p>
         </w:tc>
@@ -34642,7 +34642,7 @@
                 <w:szCs w:val="20"/>
                 <w:rFonts w:ascii="Arial" w:cs="Arial" w:eastAsia="Arial" w:hAnsi="Arial"/>
               </w:rPr>
-              <w:t xml:space="preserve">منهج أمريكي متوافق مع المعايير الأمريكية يُفضي إلى دبلوم الثانوية الأمريكية</w:t>
+              <w:t xml:space="preserve">منهج أمريكي متوافق مع المعايير التعليمية الأمريكية، وصولاً إلى شهادة الثانوية الأمريكية</w:t>
             </w:r>
           </w:p>
         </w:tc>
@@ -34719,7 +34719,7 @@
                 <w:szCs w:val="20"/>
                 <w:rFonts w:ascii="Arial" w:cs="Arial" w:eastAsia="Arial" w:hAnsi="Arial"/>
               </w:rPr>
-              <w:t xml:space="preserve">معتمدة من NEASC وCognia، وتقدّم برامج College Board</w:t>
+              <w:t xml:space="preserve">معتمدة من جمعية نيو إنجلاند للمدارس والكليات (NEASC) ومؤسسة Cognia، وتقدم برامج معتمدة من College Board</w:t>
             </w:r>
           </w:p>
         </w:tc>
@@ -34796,7 +34796,7 @@
                 <w:szCs w:val="20"/>
                 <w:rFonts w:ascii="Arial" w:cs="Arial" w:eastAsia="Arial" w:hAnsi="Arial"/>
               </w:rPr>
-              <w:t xml:space="preserve">تعلّمٌ قائم على التفكير المستقل والإبداع وحلّ المشكلات الواقعية</w:t>
+              <w:t xml:space="preserve">نهج تعليمي يرتكز على التفكير المستقل والإبداع وحل المشكلات الواقعية</w:t>
             </w:r>
           </w:p>
         </w:tc>
@@ -34873,7 +34873,7 @@
                 <w:szCs w:val="20"/>
                 <w:rFonts w:ascii="Arial" w:cs="Arial" w:eastAsia="Arial" w:hAnsi="Arial"/>
               </w:rPr>
-              <w:t xml:space="preserve">مرافق حديثة — مختبرات علوم ومكتبات واستوديوهات فنون ومناطق لعب مخصّصة</w:t>
+              <w:t xml:space="preserve">مرافق حديثة تشمل مختبرات العلوم والمكتبات واستوديوهات الفنون ومناطق مخصصة للعب</w:t>
             </w:r>
           </w:p>
         </w:tc>
@@ -35079,7 +35079,7 @@
                 <w:szCs w:val="20"/>
                 <w:rFonts w:ascii="Arial" w:cs="Arial" w:eastAsia="Arial" w:hAnsi="Arial"/>
               </w:rPr>
-              <w:t xml:space="preserve">منهج أمريكي مُثرى بإطار البكالوريا الدولية — من الحضانة حتى الصف التاسع، في قلب الرياض.</w:t>
+              <w:t xml:space="preserve">منهج أمريكي مُعزّز بإطار البكالوريا الدولية (IB)، من مرحلة الحضانة حتى الصف التاسع، في قلب مدينة الرياض.</w:t>
             </w:r>
           </w:p>
         </w:tc>
@@ -35156,7 +35156,7 @@
                 <w:szCs w:val="20"/>
                 <w:rFonts w:ascii="Arial" w:cs="Arial" w:eastAsia="Arial" w:hAnsi="Arial"/>
               </w:rPr>
-              <w:t xml:space="preserve">يُعدّ فرع قرطبة لمدارس جلوبال العالمية الحديثة من المدارس العالمية الرائدة في الرياض، ويقدّم منهجًا أمريكيًا مُثرى بإطار البكالوريا الدولية. وبخدمته الطلبة من الحضانة حتى الصف التاسع، يوفّر الفرع بيئة تعلّم راعية تعزّز التميّز الأكاديمي وبناء الشخصية والمواطنة العالمية، مع إعداد الطلبة للنجاح مدى الحياة.</w:t>
+              <w:t xml:space="preserve">تُعد مدرسة MGIS – قرطبة إحدى المدارس الدولية الرائدة في مدينة الرياض، وتقدم منهجاً أمريكياً مُعزّزاً بإطار البكالوريا الدولية (IB). وتستقبل المدرسة الطلاب من مرحلة الحضانة حتى الصف التاسع، وتوفر بيئة تعليمية داعمة ومحفّزة تعزز التميز الأكاديمي، وتنمية الشخصية، وترسيخ مفهوم المواطنة العالمية، بما يُعدّ الطلاب للنجاح والتعلّم مدى الحياة.</w:t>
             </w:r>
           </w:p>
         </w:tc>
@@ -35233,7 +35233,7 @@
                 <w:szCs w:val="20"/>
                 <w:rFonts w:ascii="Arial" w:cs="Arial" w:eastAsia="Arial" w:hAnsi="Arial"/>
               </w:rPr>
-              <w:t xml:space="preserve">منهج أمريكي مبني على إطار البكالوريا الدولية للسنوات الابتدائية (IB-PYP)</w:t>
+              <w:t xml:space="preserve">منهج أمريكي مُصمم وفق إطار برنامج السنوات الابتدائية للبكالوريا الدولية (IB-PYP)</w:t>
             </w:r>
           </w:p>
         </w:tc>
@@ -35310,7 +35310,7 @@
                 <w:szCs w:val="20"/>
                 <w:rFonts w:ascii="Arial" w:cs="Arial" w:eastAsia="Arial" w:hAnsi="Arial"/>
               </w:rPr>
-              <w:t xml:space="preserve">متوسط حجم الصف 18 طالبًا، بحدٍّ أقصى 24</w:t>
+              <w:t xml:space="preserve">متوسط عدد الطلاب في الفصل 18 طالباً، وبحد أقصى 24 طالباً</w:t>
             </w:r>
           </w:p>
         </w:tc>
@@ -35387,7 +35387,7 @@
                 <w:szCs w:val="20"/>
                 <w:rFonts w:ascii="Arial" w:cs="Arial" w:eastAsia="Arial" w:hAnsi="Arial"/>
               </w:rPr>
-              <w:t xml:space="preserve">مرافق متكاملة: مختبرات علوم وفنون وموسيقى ومسرح</w:t>
+              <w:t xml:space="preserve">مرافق تعليمية متكاملة تشمل مختبرات العلوم والفنون والموسيقى والمسرح</w:t>
             </w:r>
           </w:p>
         </w:tc>
@@ -35464,7 +35464,7 @@
                 <w:szCs w:val="20"/>
                 <w:rFonts w:ascii="Arial" w:cs="Arial" w:eastAsia="Arial" w:hAnsi="Arial"/>
               </w:rPr>
-              <w:t xml:space="preserve">أندية في القراءة والشطرنج والموسيقى وإعادة التدوير والفنون</w:t>
+              <w:t xml:space="preserve">مجموعة متنوعة من الأندية تشمل القراءة والشطرنج والموسيقى وإعادة التدوير والفنون</w:t>
             </w:r>
           </w:p>
         </w:tc>
@@ -35541,7 +35541,7 @@
                 <w:szCs w:val="20"/>
                 <w:rFonts w:ascii="Arial" w:cs="Arial" w:eastAsia="Arial" w:hAnsi="Arial"/>
               </w:rPr>
-              <w:t xml:space="preserve">رياضات: كرة القدم وكرة السلة والجمباز والأيروبيك</w:t>
+              <w:t xml:space="preserve">أنشطة رياضية تشمل كرة القدم وكرة السلة والجمباز والتمارين الهوائية</w:t>
             </w:r>
           </w:p>
         </w:tc>
@@ -35618,7 +35618,7 @@
                 <w:szCs w:val="20"/>
                 <w:rFonts w:ascii="Arial" w:cs="Arial" w:eastAsia="Arial" w:hAnsi="Arial"/>
               </w:rPr>
-              <w:t xml:space="preserve">تعليمٌ قوي للغة العربية وبرنامج للسلوك والأخلاق</w:t>
+              <w:t xml:space="preserve">برنامج متقدم للغة العربية وبرنامج متكامل لتعزيز القيم والسلوكيات</w:t>
             </w:r>
           </w:p>
         </w:tc>
@@ -35824,7 +35824,7 @@
                 <w:szCs w:val="20"/>
                 <w:rFonts w:ascii="Arial" w:cs="Arial" w:eastAsia="Arial" w:hAnsi="Arial"/>
               </w:rPr>
-              <w:t xml:space="preserve">يقدّم تجارب تعلّم مبتكرة تُلهم الفضول والإبداع والإنجاز مدى الحياة.</w:t>
+              <w:t xml:space="preserve">تقديم تجارب تعليمية مبتكرة تلهم الفضول والإبداع، وتغرس شغف التعلّم والتميّز المستمر.</w:t>
             </w:r>
           </w:p>
         </w:tc>
@@ -35901,7 +35901,7 @@
                 <w:szCs w:val="20"/>
                 <w:rFonts w:ascii="Arial" w:cs="Arial" w:eastAsia="Arial" w:hAnsi="Arial"/>
               </w:rPr>
-              <w:t xml:space="preserve">فرع المدينة الرقمية هو أحدث فروع الشبكة — ثلاثي اللغة وغني بالتقنية، ومصمَّم حول الشراكة مع الأسرة ونهج حبّ التعلّم.</w:t>
+              <w:t xml:space="preserve">تُعد مدرسة MGIS في المدينة الرقمية أحدث مدارس الشبكة، وتتميز ببيئة تعليمية غنية بالتكنولوجيا وثلاثية اللغات، تقوم على الشراكة الفاعلة مع الأسرة وتعزيز حب التعلّم لدى الطلاب.</w:t>
             </w:r>
           </w:p>
         </w:tc>
@@ -35978,7 +35978,7 @@
                 <w:szCs w:val="20"/>
                 <w:rFonts w:ascii="Arial" w:cs="Arial" w:eastAsia="Arial" w:hAnsi="Arial"/>
               </w:rPr>
-              <w:t xml:space="preserve">منهج أمريكي قائم على معايير الأساس المشترك الأمريكية</w:t>
+              <w:t xml:space="preserve">منهج أمريكي يستند إلى معايير Common Core الأمريكية</w:t>
             </w:r>
           </w:p>
         </w:tc>
@@ -36055,7 +36055,7 @@
                 <w:szCs w:val="20"/>
                 <w:rFonts w:ascii="Arial" w:cs="Arial" w:eastAsia="Arial" w:hAnsi="Arial"/>
               </w:rPr>
-              <w:t xml:space="preserve">دمج تقني متقدّم في جميع الفصول</w:t>
+              <w:t xml:space="preserve">توظيف متقدم للتكنولوجيا في جميع الفصول الدراسية</w:t>
             </w:r>
           </w:p>
         </w:tc>
@@ -36132,7 +36132,7 @@
                 <w:szCs w:val="20"/>
                 <w:rFonts w:ascii="Arial" w:cs="Arial" w:eastAsia="Arial" w:hAnsi="Arial"/>
               </w:rPr>
-              <w:t xml:space="preserve">ثلاثي اللغة: الإنجليزية والعربية والفرنسية</w:t>
+              <w:t xml:space="preserve">تعليم بثلاث لغات: الإنجليزية والعربية والفرنسية</w:t>
             </w:r>
           </w:p>
         </w:tc>
@@ -36209,7 +36209,7 @@
                 <w:szCs w:val="20"/>
                 <w:rFonts w:ascii="Arial" w:cs="Arial" w:eastAsia="Arial" w:hAnsi="Arial"/>
               </w:rPr>
-              <w:t xml:space="preserve">تعليم مختلط مع انخراط قوي لأولياء الأمور</w:t>
+              <w:t xml:space="preserve">تعليم مختلط مع مشاركة فاعلة من أولياء الأمور</w:t>
             </w:r>
           </w:p>
         </w:tc>
@@ -36286,7 +36286,7 @@
                 <w:szCs w:val="20"/>
                 <w:rFonts w:ascii="Arial" w:cs="Arial" w:eastAsia="Arial" w:hAnsi="Arial"/>
               </w:rPr>
-              <w:t xml:space="preserve">ثقافة تُعنى بالأسرة</w:t>
+              <w:t xml:space="preserve">بيئة مدرسية تتمحور حول الأسرة وتعزز مشاركتها</w:t>
             </w:r>
           </w:p>
         </w:tc>
@@ -36363,7 +36363,7 @@
                 <w:szCs w:val="20"/>
                 <w:rFonts w:ascii="Arial" w:cs="Arial" w:eastAsia="Arial" w:hAnsi="Arial"/>
               </w:rPr>
-              <w:t xml:space="preserve">ساعات العمل: الأحد–الخميس، 7:30 صباحًا–2:00 ظهرًا</w:t>
+              <w:t xml:space="preserve">ساعات الدوام: من الأحد إلى الخميس، من 7:30 صباحاً حتى 2:00 ظهراً</w:t>
             </w:r>
           </w:p>
         </w:tc>
@@ -36569,7 +36569,7 @@
                 <w:szCs w:val="20"/>
                 <w:rFonts w:ascii="Arial" w:cs="Arial" w:eastAsia="Arial" w:hAnsi="Arial"/>
               </w:rPr>
-              <w:t xml:space="preserve">مدرسة أمريكية مرتقبة من الروضة حتى الصف الثاني عشر في مدينة الشارقة المستدامة — حرمٌ بقيمة 50 مليون دولار أمريكي مصمَّم لنحو 2,435 طالبًا، يُطوَّر بالشراكة مع «شروق».</w:t>
+              <w:t xml:space="preserve">مدرسة مرتقبة في مدينة الشارقة المستدامة تقدم المنهج الأمريكي من مرحلة رياض الأطفال حتى الصف الثاني عشر، باستثمار يبلغ 50 مليون دولار أمريكي، وبطاقة استيعابية مصممة لنحو 2,435 طالباً، ويجري تطويرها بالشراكة مع هيئة الشارقة للاستثمار والتطوير «شروق».</w:t>
             </w:r>
           </w:p>
         </w:tc>
@@ -36646,7 +36646,7 @@
                 <w:szCs w:val="20"/>
                 <w:rFonts w:ascii="Arial" w:cs="Arial" w:eastAsia="Arial" w:hAnsi="Arial"/>
               </w:rPr>
-              <w:t xml:space="preserve">مدرسة مرتقبة من الروضة حتى الصف الثاني عشر في مدينة الشارقة المستدامة، تُطوَّر بالشراكة بين مدارك وهيئة الشارقة للاستثمار والتطوير «شروق». وباتّباعها المنهج الأمريكي، صُمِّم الحرم البالغة قيمته 50 مليون دولار أمريكي لنحو 2,435 طالبًا من الروضة حتى الصف الثاني عشر — ضمن إحدى أبرز المجتمعات المستدامة في الإمارة، وهو مبنيٌّ حول الابتكار والرفاه والتعلّم التعاوني.</w:t>
+              <w:t xml:space="preserve">مدرسة مرتقبة في مدينة الشارقة المستدامة، يجري تطويرها بالشراكة بين مدارك وهيئة الشارقة للاستثمار والتطوير «شروق». وتقدم المدرسة المنهج الأمريكي من مرحلة رياض الأطفال حتى الصف الثاني عشر، باستثمار يبلغ 50 مليون دولار أمريكي، وبطاقة استيعابية مصممة لنحو 2,435 طالباً. وتقع المدرسة ضمن إحدى أبرز المجتمعات المستدامة في إمارة الشارقة، وقد صُممت لتوفير بيئة تعليمية ترتكز على الابتكار والرفاه والتعلّم التعاوني.</w:t>
             </w:r>
           </w:p>
         </w:tc>
@@ -36723,7 +36723,7 @@
                 <w:szCs w:val="20"/>
                 <w:rFonts w:ascii="Arial" w:cs="Arial" w:eastAsia="Arial" w:hAnsi="Arial"/>
               </w:rPr>
-              <w:t xml:space="preserve">منهج أمريكي، من الروضة حتى الصف الثاني عشر</w:t>
+              <w:t xml:space="preserve">المنهج الأمريكي من مرحلة رياض الأطفال حتى الصف الثاني عشر</w:t>
             </w:r>
           </w:p>
         </w:tc>
@@ -36800,7 +36800,7 @@
                 <w:szCs w:val="20"/>
                 <w:rFonts w:ascii="Arial" w:cs="Arial" w:eastAsia="Arial" w:hAnsi="Arial"/>
               </w:rPr>
-              <w:t xml:space="preserve">حرمٌ بقيمة 50 مليون دولار أمريكي في مدينة الشارقة المستدامة</w:t>
+              <w:t xml:space="preserve">حرم مدرسي بقيمة استثمارية تبلغ 50 مليون دولار أمريكي في مدينة الشارقة المستدامة</w:t>
             </w:r>
           </w:p>
         </w:tc>
@@ -36877,7 +36877,7 @@
                 <w:szCs w:val="20"/>
                 <w:rFonts w:ascii="Arial" w:cs="Arial" w:eastAsia="Arial" w:hAnsi="Arial"/>
               </w:rPr>
-              <w:t xml:space="preserve">مصمَّم لنحو 2,435 طالبًا على موقعٍ مساحته 29,275 م²</w:t>
+              <w:t xml:space="preserve">مصمم لاستيعاب نحو 2,435 طالباً على مساحة 29,275 م²</w:t>
             </w:r>
           </w:p>
         </w:tc>
@@ -36954,7 +36954,7 @@
                 <w:szCs w:val="20"/>
                 <w:rFonts w:ascii="Arial" w:cs="Arial" w:eastAsia="Arial" w:hAnsi="Arial"/>
               </w:rPr>
-              <w:t xml:space="preserve">مختبرات للعلوم وتقنية المعلومات والروبوتات والهندسة والرياضيات، مع مساحات للابتكار والصناعة</w:t>
+              <w:t xml:space="preserve">مختبرات للعلوم وتكنولوجيا المعلومات والروبوتات والهندسة والرياضيات، إلى جانب مساحات مخصصة للابتكار والتصميم والتصنيع</w:t>
             </w:r>
           </w:p>
         </w:tc>
@@ -37031,7 +37031,7 @@
                 <w:szCs w:val="20"/>
                 <w:rFonts w:ascii="Arial" w:cs="Arial" w:eastAsia="Arial" w:hAnsi="Arial"/>
               </w:rPr>
-              <w:t xml:space="preserve">ثلاث مكتبات واستوديوهات فنون ومسرح صندوقي أسود وقاعة متعددة الأغراض تتّسع لـ500 مقعد</w:t>
+              <w:t xml:space="preserve">ثلاث مكتبات، واستوديوهات للفنون، ومسرح «الصندوق الأسود»، وقاعة متعددة الأغراض تتسع لـ500 شخص</w:t>
             </w:r>
           </w:p>
         </w:tc>
@@ -37108,7 +37108,7 @@
                 <w:szCs w:val="20"/>
                 <w:rFonts w:ascii="Arial" w:cs="Arial" w:eastAsia="Arial" w:hAnsi="Arial"/>
               </w:rPr>
-              <w:t xml:space="preserve">مركز لدعم التعلّم يضمّ غرف علاج ودمج حسّي وعيادات مخصّصة</w:t>
+              <w:t xml:space="preserve">مركز لدعم التعلّم يضم غرفاً للعلاج والتكامل الحسي، إلى جانب عيادات مخصصة</w:t>
             </w:r>
           </w:p>
         </w:tc>
@@ -37185,7 +37185,7 @@
                 <w:szCs w:val="20"/>
                 <w:rFonts w:ascii="Arial" w:cs="Arial" w:eastAsia="Arial" w:hAnsi="Arial"/>
               </w:rPr>
-              <w:t xml:space="preserve">صالة رياضية مغلقة ومسبح رئيسي ومسبح للمتعلّمين ومرافق ترفيهية على السطح</w:t>
+              <w:t xml:space="preserve">صالة رياضية داخلية، ومسبح رئيسي ومسبح مخصص للمتعلمين، ومساحات ترفيهية على سطح المبنى</w:t>
             </w:r>
           </w:p>
         </w:tc>
@@ -37262,7 +37262,7 @@
                 <w:szCs w:val="20"/>
                 <w:rFonts w:ascii="Arial" w:cs="Arial" w:eastAsia="Arial" w:hAnsi="Arial"/>
               </w:rPr>
-              <w:t xml:space="preserve">مساحات خضراء وحديقة نباتية وممرات مشاة مظلّلة</w:t>
+              <w:t xml:space="preserve">مساحات خضراء، وحديقة نباتية، وممرات مشاة مظللة</w:t>
             </w:r>
           </w:p>
         </w:tc>
@@ -37501,7 +37501,7 @@
                 <w:szCs w:val="20"/>
                 <w:rFonts w:ascii="Arial" w:cs="Arial" w:eastAsia="Arial" w:hAnsi="Arial"/>
               </w:rPr>
-              <w:t xml:space="preserve">مدارك المتحدة توقّع اتفاقية مدتها 25 عامًا لتطوير فرعٍ ثالث لمدارس جلوبال العالمية الحديثة في الرياض</w:t>
+              <w:t xml:space="preserve">مدارك المتحدة توقّع اتفاقية لمدة 25 عاماً لتطوير الحرم الثالث لمدارس MGIS في الرياض</w:t>
             </w:r>
           </w:p>
         </w:tc>
@@ -37578,7 +37578,7 @@
                 <w:szCs w:val="20"/>
                 <w:rFonts w:ascii="Arial" w:cs="Arial" w:eastAsia="Arial" w:hAnsi="Arial"/>
               </w:rPr>
-              <w:t xml:space="preserve">من خلال شركتها التابعة «مودرن مينا للتعليم»، وقّعت مدارك المتحدة اتفاقية استثمارية مدتها 25 عامًا لتطوير الفرع الثالث لمدارس جلوبال العالمية الحديثة (MGIS) في الرياض.</w:t>
+              <w:t xml:space="preserve">من خلال شركتها التابعة «شركة مينا الحديثة للتعليم»، وقّعت مدارك المتحدة اتفاقية استثمارية لمدة 25 عاماً لتطوير الحرم الثالث لمدارس Modern Global International Schools (MGIS) في مدينة الرياض.</w:t>
             </w:r>
           </w:p>
         </w:tc>
@@ -37861,7 +37861,7 @@
                 <w:szCs w:val="20"/>
                 <w:rFonts w:ascii="Arial" w:cs="Arial" w:eastAsia="Arial" w:hAnsi="Arial"/>
               </w:rPr>
-              <w:t xml:space="preserve">مدرسة المعارف الأمريكية تحصل على جائزة الرفاه للمدارس</w:t>
+              <w:t xml:space="preserve">مدرسة المعارف الأمريكية تحصد جائزة الرفاه المدرسي</w:t>
             </w:r>
           </w:p>
         </w:tc>
@@ -37938,7 +37938,7 @@
                 <w:szCs w:val="20"/>
                 <w:rFonts w:ascii="Arial" w:cs="Arial" w:eastAsia="Arial" w:hAnsi="Arial"/>
               </w:rPr>
-              <w:t xml:space="preserve">حصلت مدرسة المعارف الأمريكية على جائزة الرفاه للمدارس (WAS)، المقدَّمة بالشراكة مع المكتب الوطني للطفولة — باعتمادٍ ساري المفعول حتى عام 2029.</w:t>
+              <w:t xml:space="preserve">حصلت مدرسة المعارف الأمريكية على جائزة الرفاه المدرسي (WAS)، المقدّمة بالشراكة مع المكتب الوطني للأطفال (National Children's Bureau)، والمعتمدة حتى عام 2029.</w:t>
             </w:r>
           </w:p>
         </w:tc>

</xml_diff>